<commit_message>
tarea primer poryecto django documento
</commit_message>
<xml_diff>
--- a/parcial-2/tareas/Actividad_Django I_proyectoa_pp_y_primer_modelo.docx
+++ b/parcial-2/tareas/Actividad_Django I_proyectoa_pp_y_primer_modelo.docx
@@ -21,6 +21,7 @@
           <w:highlight w:val="none"/>
         </w:rPr>
       </w:r>
+      <w:r/>
     </w:p>
     <w:p>
       <w:pPr>
@@ -32,7 +33,6 @@
           <w:highlight w:val="none"/>
         </w:rPr>
       </w:pPr>
-      <w:r/>
       <w:r>
         <mc:AlternateContent>
           <mc:Choice Requires="wpg">
@@ -102,11 +102,20 @@
           </mc:Fallback>
         </mc:AlternateContent>
       </w:r>
-      <w:r/>
-      <w:r/>
-      <w:r/>
-      <w:r/>
-      <w:r/>
+      <w:r>
+        <w:rPr>
+          <w:highlight w:val="none"/>
+        </w:rPr>
+      </w:r>
+    </w:p>
+    <w:p>
+      <w:pPr>
+        <w:pBdr/>
+        <w:spacing/>
+        <w:ind w:right="-141" w:firstLine="0" w:left="-709"/>
+        <w:jc w:val="left"/>
+        <w:rPr/>
+      </w:pPr>
       <w:r/>
       <w:r/>
     </w:p>
@@ -120,7 +129,6 @@
       </w:pPr>
       <w:r/>
       <w:r/>
-      <w:r/>
     </w:p>
     <w:p>
       <w:pPr>
@@ -130,7 +138,6 @@
         <w:jc w:val="left"/>
         <w:rPr/>
       </w:pPr>
-      <w:r/>
       <w:r/>
       <w:r/>
     </w:p>
@@ -142,19 +149,6 @@
         <w:jc w:val="left"/>
         <w:rPr/>
       </w:pPr>
-      <w:r/>
-      <w:r/>
-      <w:r/>
-    </w:p>
-    <w:p>
-      <w:pPr>
-        <w:pBdr/>
-        <w:spacing/>
-        <w:ind w:right="-141" w:firstLine="0" w:left="-709"/>
-        <w:jc w:val="left"/>
-        <w:rPr/>
-      </w:pPr>
-      <w:r/>
       <w:r/>
       <w:r/>
     </w:p>
@@ -177,6 +171,13 @@
           <w:highlight w:val="none"/>
         </w:rPr>
         <w:t xml:space="preserve">Proyecto creado y arrancado</w:t>
+      </w:r>
+      <w:r>
+        <w:rPr>
+          <w:b/>
+          <w:bCs/>
+          <w:highlight w:val="none"/>
+        </w:rPr>
       </w:r>
       <w:r>
         <w:rPr>
@@ -328,6 +329,11 @@
           <w:highlight w:val="none"/>
         </w:rPr>
       </w:r>
+      <w:r>
+        <w:rPr>
+          <w:highlight w:val="none"/>
+        </w:rPr>
+      </w:r>
     </w:p>
     <w:p>
       <w:pPr>
@@ -412,11 +418,6 @@
             </w:pict>
           </mc:Fallback>
         </mc:AlternateContent>
-      </w:r>
-      <w:r>
-        <w:rPr>
-          <w:highlight w:val="none"/>
-        </w:rPr>
       </w:r>
       <w:r>
         <w:rPr>
@@ -689,11 +690,6 @@
           <w:highlight w:val="none"/>
         </w:rPr>
       </w:r>
-      <w:r>
-        <w:rPr>
-          <w:highlight w:val="none"/>
-        </w:rPr>
-      </w:r>
     </w:p>
     <w:p>
       <w:pPr>
@@ -782,6 +778,13 @@
           <w:highlight w:val="none"/>
         </w:rPr>
       </w:r>
+      <w:r>
+        <w:rPr>
+          <w:b/>
+          <w:bCs/>
+          <w:highlight w:val="none"/>
+        </w:rPr>
+      </w:r>
     </w:p>
     <w:p>
       <w:pPr>
@@ -793,7 +796,6 @@
           <w:highlight w:val="none"/>
         </w:rPr>
       </w:pPr>
-      <w:r/>
       <w:r>
         <mc:AlternateContent>
           <mc:Choice Requires="wpg">
@@ -868,6 +870,11 @@
           <w:highlight w:val="none"/>
         </w:rPr>
       </w:r>
+      <w:r>
+        <w:rPr>
+          <w:highlight w:val="none"/>
+        </w:rPr>
+      </w:r>
     </w:p>
     <w:p>
       <w:pPr>
@@ -897,7 +904,7 @@
     </w:p>
     <w:p>
       <w:pPr>
-        <w:pStyle w:val="668"/>
+        <w:pStyle w:val="892"/>
         <w:numPr>
           <w:ilvl w:val="0"/>
           <w:numId w:val="1"/>
@@ -916,7 +923,6 @@
         </w:rPr>
         <w:t xml:space="preserve">En Flask el id salía de max(id) + 1. Con el SQL de sqlmigrate: ¿quién asigna ahora el id y por qué eso resuelve las dos </w:t>
       </w:r>
-      <w:r/>
       <w:r>
         <w:rPr>
           <w:highlight w:val="none"/>
@@ -928,6 +934,11 @@
           <w:highlight w:val="none"/>
         </w:rPr>
       </w:r>
+      <w:r>
+        <w:rPr>
+          <w:highlight w:val="none"/>
+        </w:rPr>
+      </w:r>
     </w:p>
     <w:p>
       <w:pPr>
@@ -947,7 +958,22 @@
           <w:bCs/>
           <w:highlight w:val="none"/>
         </w:rPr>
-        <w:t xml:space="preserve">Ahora el id incremental lo maneja la base de datos mediante AUTOINCREMENT, esto hace que la aplicación tenga que calcular el siguiente id, con esto si dos usuarios hacen la petición al mismo tiempo la base de datos asigna un id diferente sin depender de un max(id) + 1 y los id tampoco se reinician porque ahora son almacenados en la base de datos</w:t>
+        <w:t xml:space="preserve">Ahora el id incremental lo maneja la base de datos mediante AUTOINCREMENT, esto hace que la</w:t>
+      </w:r>
+      <w:r>
+        <w:rPr>
+          <w:b/>
+          <w:bCs/>
+          <w:highlight w:val="none"/>
+        </w:rPr>
+        <w:t xml:space="preserve"> aplicación tenga que calcular el siguiente id, con esto si dos usuarios hacen la petición al mismo tiempo la base de datos asigna un id diferente sin depender de un max(id) + 1 y los id tampoco se reinician porque ahora son almacenados en la base de datos</w:t>
+      </w:r>
+      <w:r>
+        <w:rPr>
+          <w:b/>
+          <w:bCs/>
+          <w:highlight w:val="none"/>
+        </w:rPr>
       </w:r>
       <w:r>
         <w:rPr>
@@ -985,7 +1011,7 @@
     </w:p>
     <w:p>
       <w:pPr>
-        <w:pStyle w:val="668"/>
+        <w:pStyle w:val="892"/>
         <w:numPr>
           <w:ilvl w:val="0"/>
           <w:numId w:val="1"/>
@@ -1008,6 +1034,11 @@
           <w:highlight w:val="none"/>
         </w:rPr>
         <w:t xml:space="preserve">¿Por qué db.sqlite3 y .venv/ van en el .gitignore, y en cambio la carpeta migrations/ sí se versiona?</w:t>
+      </w:r>
+      <w:r>
+        <w:rPr>
+          <w:highlight w:val="none"/>
+        </w:rPr>
       </w:r>
       <w:r>
         <w:rPr>
@@ -1058,6 +1089,13 @@
           <w:highlight w:val="none"/>
         </w:rPr>
       </w:r>
+      <w:r>
+        <w:rPr>
+          <w:b/>
+          <w:bCs/>
+          <w:highlight w:val="none"/>
+        </w:rPr>
+      </w:r>
     </w:p>
     <w:p>
       <w:pPr>
@@ -1087,7 +1125,7 @@
     </w:p>
     <w:p>
       <w:pPr>
-        <w:pStyle w:val="668"/>
+        <w:pStyle w:val="892"/>
         <w:numPr>
           <w:ilvl w:val="0"/>
           <w:numId w:val="1"/>
@@ -1115,13 +1153,12 @@
         <w:rPr>
           <w:highlight w:val="none"/>
         </w:rPr>
+        <w:t xml:space="preserve">¿unique=True en spotify_id es buena decisión para la carga del martes? Justifica.</w:t>
       </w:r>
-      <w:r/>
       <w:r>
         <w:rPr>
           <w:highlight w:val="none"/>
         </w:rPr>
-        <w:t xml:space="preserve">¿unique=True en spotify_id es buena decisión para la carga del martes? Justifica.</w:t>
       </w:r>
       <w:r>
         <w:rPr>
@@ -1147,7 +1184,23 @@
           <w:bCs/>
           <w:highlight w:val="none"/>
         </w:rPr>
-        <w:t xml:space="preserve">Al buscar id repetidos vi que algunos track_id se repiten varias veces en los que solo cambian datos como el nombre de la canción si fue remasterizada o si pertenece a algunos playlist diferentes, por eso unique=true no seria una buena decisión para la carga de datos ya que no guardaría las canciones que tienen el mismo id, pero pertenecen a diferentes playlist, dependerá igualmente si la carga de materias se requieran guardar los datos como playlist, o si como hicimos en el ejemplo de esta practica solo datos de la canción.</w:t>
+        <w:t xml:space="preserve">Al buscar id repet</w:t>
+      </w:r>
+      <w:r>
+        <w:rPr>
+          <w:b/>
+          <w:bCs/>
+          <w:highlight w:val="none"/>
+        </w:rPr>
+        <w:t xml:space="preserve">idos vi que algunos track_id se repiten varias veces en los que solo cambian datos como el nombre de la canción si fue remasterizada o si pertenece a algunos playlist diferentes, por eso unique=true no seria una buena decisión para la carga de datos ya que</w:t>
+      </w:r>
+      <w:r>
+        <w:rPr>
+          <w:b/>
+          <w:bCs/>
+          <w:highlight w:val="none"/>
+        </w:rPr>
+        <w:t xml:space="preserve"> no guardaría las canciones que tienen el mismo id, pero pertenecen a diferentes playlist, dependerá igualmente si la carga de materias se requieran guardar los datos como playlist, o si como hicimos en el ejemplo de esta practica solo datos de la canción.</w:t>
       </w:r>
       <w:r>
         <w:rPr>
@@ -1156,10 +1209,122 @@
           <w:highlight w:val="none"/>
         </w:rPr>
       </w:r>
+    </w:p>
+    <w:p>
+      <w:pPr>
+        <w:pBdr/>
+        <w:spacing w:after="0"/>
+        <w:ind w:right="-141" w:firstLine="0" w:left="0"/>
+        <w:jc w:val="left"/>
+        <w:rPr>
+          <w:b/>
+          <w:bCs/>
+          <w:highlight w:val="none"/>
+        </w:rPr>
+      </w:pPr>
       <w:r>
         <w:rPr>
           <w:b/>
           <w:bCs/>
+          <w:highlight w:val="none"/>
+        </w:rPr>
+        <w:t xml:space="preserve">Declaración de IA</w:t>
+      </w:r>
+      <w:r>
+        <w:rPr>
+          <w:b/>
+          <w:bCs/>
+          <w:highlight w:val="none"/>
+        </w:rPr>
+      </w:r>
+    </w:p>
+    <w:p>
+      <w:pPr>
+        <w:pBdr/>
+        <w:spacing w:after="0"/>
+        <w:ind w:right="-141" w:firstLine="0" w:left="0"/>
+        <w:jc w:val="left"/>
+        <w:rPr>
+          <w:b w:val="0"/>
+          <w:bCs w:val="0"/>
+          <w:highlight w:val="none"/>
+        </w:rPr>
+      </w:pPr>
+      <w:r>
+        <w:rPr>
+          <w:b w:val="0"/>
+          <w:bCs w:val="0"/>
+          <w:highlight w:val="none"/>
+        </w:rPr>
+        <w:t xml:space="preserve">Use IA </w:t>
+      </w:r>
+      <w:r>
+        <w:rPr>
+          <w:b w:val="0"/>
+          <w:bCs w:val="0"/>
+          <w:highlight w:val="none"/>
+        </w:rPr>
+        <w:t xml:space="preserve">únicamente </w:t>
+      </w:r>
+      <w:r>
+        <w:rPr>
+          <w:b w:val="0"/>
+          <w:bCs w:val="0"/>
+          <w:highlight w:val="none"/>
+        </w:rPr>
+      </w:r>
+      <w:r>
+        <w:rPr>
+          <w:b w:val="0"/>
+          <w:bCs w:val="0"/>
+          <w:highlight w:val="none"/>
+        </w:rPr>
+        <w:t xml:space="preserve">para investigar cómo ejecutar el proyecto, que es con</w:t>
+      </w:r>
+      <w:r>
+        <w:rPr>
+          <w:b w:val="0"/>
+          <w:bCs w:val="0"/>
+          <w:highlight w:val="none"/>
+        </w:rPr>
+        <w:t xml:space="preserve"> </w:t>
+      </w:r>
+      <w:r>
+        <w:rPr>
+          <w:b w:val="0"/>
+          <w:bCs w:val="0"/>
+          <w:highlight w:val="none"/>
+        </w:rPr>
+        <w:t xml:space="preserve">“python manage.py runserver”, esto me llevo a investigar en que otras funcionalidades tiene “manage.py”, por ultimo pedí que me diera los scripts de python</w:t>
+      </w:r>
+      <w:r>
+        <w:rPr>
+          <w:b w:val="0"/>
+          <w:bCs w:val="0"/>
+          <w:highlight w:val="none"/>
+        </w:rPr>
+        <w:t xml:space="preserve"> para insertar canciones desde el shell y así facilitar la carga en la base de datos. Revisé y adapté esos scripts para que coincidiera a las canciones del csv, y entend</w:t>
+      </w:r>
+      <w:r>
+        <w:rPr>
+          <w:b w:val="0"/>
+          <w:bCs w:val="0"/>
+          <w:highlight w:val="none"/>
+        </w:rPr>
+        <w:t xml:space="preserve">í</w:t>
+      </w:r>
+      <w:r>
+        <w:rPr>
+          <w:b w:val="0"/>
+          <w:bCs w:val="0"/>
+          <w:highlight w:val="none"/>
+        </w:rPr>
+        <w:t xml:space="preserve"> cómo funciona la inserción de canciones en la base de datos.</w:t>
+      </w:r>
+      <w:r>
+        <w:rPr>
+          <w:b w:val="0"/>
+          <w:bCs w:val="0"/>
           <w:highlight w:val="none"/>
         </w:rPr>
       </w:r>
@@ -1186,7 +1351,6 @@
         <w:ind/>
         <w:rPr/>
       </w:pPr>
-      <w:r/>
       <w:r>
         <w:separator/>
       </w:r>
@@ -1201,7 +1365,6 @@
         <w:ind/>
         <w:rPr/>
       </w:pPr>
-      <w:r/>
       <w:r>
         <w:continuationSeparator/>
       </w:r>
@@ -1221,7 +1384,6 @@
         <w:ind/>
         <w:rPr/>
       </w:pPr>
-      <w:r/>
       <w:r>
         <w:separator/>
       </w:r>
@@ -1236,7 +1398,6 @@
         <w:ind/>
         <w:rPr/>
       </w:pPr>
-      <w:r/>
       <w:r>
         <w:continuationSeparator/>
       </w:r>
@@ -1541,9 +1702,9 @@
     <w:lsdException w:name="Bibliography" w:uiPriority="37"/>
     <w:lsdException w:name="TOC Heading" w:uiPriority="39" w:qFormat="1"/>
   </w:latentStyles>
-  <w:style w:type="table" w:styleId="12">
+  <w:style w:type="table" w:styleId="703">
     <w:name w:val="Table Grid"/>
-    <w:basedOn w:val="665"/>
+    <w:basedOn w:val="889"/>
     <w:uiPriority w:val="59"/>
     <w:pPr>
       <w:pBdr/>
@@ -1740,9 +1901,9 @@
       </w:tcPr>
     </w:tblStylePr>
   </w:style>
-  <w:style w:type="table" w:styleId="13">
+  <w:style w:type="table" w:styleId="704">
     <w:name w:val="Table Grid Light"/>
-    <w:basedOn w:val="665"/>
+    <w:basedOn w:val="889"/>
     <w:uiPriority w:val="59"/>
     <w:pPr>
       <w:pBdr/>
@@ -1939,9 +2100,9 @@
       </w:tcPr>
     </w:tblStylePr>
   </w:style>
-  <w:style w:type="table" w:styleId="14">
+  <w:style w:type="table" w:styleId="705">
     <w:name w:val="Plain Table 1"/>
-    <w:basedOn w:val="665"/>
+    <w:basedOn w:val="889"/>
     <w:uiPriority w:val="59"/>
     <w:pPr>
       <w:pBdr/>
@@ -2164,9 +2325,9 @@
       </w:tcPr>
     </w:tblStylePr>
   </w:style>
-  <w:style w:type="table" w:styleId="15">
+  <w:style w:type="table" w:styleId="706">
     <w:name w:val="Plain Table 2"/>
-    <w:basedOn w:val="665"/>
+    <w:basedOn w:val="889"/>
     <w:uiPriority w:val="59"/>
     <w:pPr>
       <w:pBdr/>
@@ -2397,9 +2558,9 @@
       </w:tcPr>
     </w:tblStylePr>
   </w:style>
-  <w:style w:type="table" w:styleId="16">
+  <w:style w:type="table" w:styleId="707">
     <w:name w:val="Plain Table 3"/>
-    <w:basedOn w:val="665"/>
+    <w:basedOn w:val="889"/>
     <w:uiPriority w:val="99"/>
     <w:pPr>
       <w:pBdr/>
@@ -2627,9 +2788,9 @@
       </w:tcPr>
     </w:tblStylePr>
   </w:style>
-  <w:style w:type="table" w:styleId="17">
+  <w:style w:type="table" w:styleId="708">
     <w:name w:val="Plain Table 4"/>
-    <w:basedOn w:val="665"/>
+    <w:basedOn w:val="889"/>
     <w:uiPriority w:val="99"/>
     <w:pPr>
       <w:pBdr/>
@@ -2843,9 +3004,9 @@
       </w:tcPr>
     </w:tblStylePr>
   </w:style>
-  <w:style w:type="table" w:styleId="18">
+  <w:style w:type="table" w:styleId="709">
     <w:name w:val="Plain Table 5"/>
-    <w:basedOn w:val="665"/>
+    <w:basedOn w:val="889"/>
     <w:uiPriority w:val="99"/>
     <w:pPr>
       <w:pBdr/>
@@ -3076,9 +3237,9 @@
       </w:tcPr>
     </w:tblStylePr>
   </w:style>
-  <w:style w:type="table" w:styleId="19">
+  <w:style w:type="table" w:styleId="710">
     <w:name w:val="Grid Table 1 Light"/>
-    <w:basedOn w:val="665"/>
+    <w:basedOn w:val="889"/>
     <w:uiPriority w:val="99"/>
     <w:pPr>
       <w:pBdr/>
@@ -3299,9 +3460,9 @@
       </w:tcPr>
     </w:tblStylePr>
   </w:style>
-  <w:style w:type="table" w:styleId="20">
+  <w:style w:type="table" w:styleId="711">
     <w:name w:val="Grid Table 1 Light - Accent 1"/>
-    <w:basedOn w:val="665"/>
+    <w:basedOn w:val="889"/>
     <w:uiPriority w:val="99"/>
     <w:pPr>
       <w:pBdr/>
@@ -3522,9 +3683,9 @@
       </w:tcPr>
     </w:tblStylePr>
   </w:style>
-  <w:style w:type="table" w:styleId="21">
+  <w:style w:type="table" w:styleId="712">
     <w:name w:val="Grid Table 1 Light - Accent 2"/>
-    <w:basedOn w:val="665"/>
+    <w:basedOn w:val="889"/>
     <w:uiPriority w:val="99"/>
     <w:pPr>
       <w:pBdr/>
@@ -3745,9 +3906,9 @@
       </w:tcPr>
     </w:tblStylePr>
   </w:style>
-  <w:style w:type="table" w:styleId="22">
+  <w:style w:type="table" w:styleId="713">
     <w:name w:val="Grid Table 1 Light - Accent 3"/>
-    <w:basedOn w:val="665"/>
+    <w:basedOn w:val="889"/>
     <w:uiPriority w:val="99"/>
     <w:pPr>
       <w:pBdr/>
@@ -3968,9 +4129,9 @@
       </w:tcPr>
     </w:tblStylePr>
   </w:style>
-  <w:style w:type="table" w:styleId="23">
+  <w:style w:type="table" w:styleId="714">
     <w:name w:val="Grid Table 1 Light - Accent 4"/>
-    <w:basedOn w:val="665"/>
+    <w:basedOn w:val="889"/>
     <w:uiPriority w:val="99"/>
     <w:pPr>
       <w:pBdr/>
@@ -4191,9 +4352,9 @@
       </w:tcPr>
     </w:tblStylePr>
   </w:style>
-  <w:style w:type="table" w:styleId="24">
+  <w:style w:type="table" w:styleId="715">
     <w:name w:val="Grid Table 1 Light - Accent 5"/>
-    <w:basedOn w:val="665"/>
+    <w:basedOn w:val="889"/>
     <w:uiPriority w:val="99"/>
     <w:pPr>
       <w:pBdr/>
@@ -4414,9 +4575,9 @@
       </w:tcPr>
     </w:tblStylePr>
   </w:style>
-  <w:style w:type="table" w:styleId="25">
+  <w:style w:type="table" w:styleId="716">
     <w:name w:val="Grid Table 1 Light - Accent 6"/>
-    <w:basedOn w:val="665"/>
+    <w:basedOn w:val="889"/>
     <w:uiPriority w:val="99"/>
     <w:pPr>
       <w:pBdr/>
@@ -4637,9 +4798,9 @@
       </w:tcPr>
     </w:tblStylePr>
   </w:style>
-  <w:style w:type="table" w:styleId="26">
+  <w:style w:type="table" w:styleId="717">
     <w:name w:val="Grid Table 2"/>
-    <w:basedOn w:val="665"/>
+    <w:basedOn w:val="889"/>
     <w:uiPriority w:val="99"/>
     <w:pPr>
       <w:pBdr/>
@@ -4869,9 +5030,9 @@
       </w:tcPr>
     </w:tblStylePr>
   </w:style>
-  <w:style w:type="table" w:styleId="27">
+  <w:style w:type="table" w:styleId="718">
     <w:name w:val="Grid Table 2 - Accent 1"/>
-    <w:basedOn w:val="665"/>
+    <w:basedOn w:val="889"/>
     <w:uiPriority w:val="99"/>
     <w:pPr>
       <w:pBdr/>
@@ -5101,9 +5262,9 @@
       </w:tcPr>
     </w:tblStylePr>
   </w:style>
-  <w:style w:type="table" w:styleId="28">
+  <w:style w:type="table" w:styleId="719">
     <w:name w:val="Grid Table 2 - Accent 2"/>
-    <w:basedOn w:val="665"/>
+    <w:basedOn w:val="889"/>
     <w:uiPriority w:val="99"/>
     <w:pPr>
       <w:pBdr/>
@@ -5333,9 +5494,9 @@
       </w:tcPr>
     </w:tblStylePr>
   </w:style>
-  <w:style w:type="table" w:styleId="29">
+  <w:style w:type="table" w:styleId="720">
     <w:name w:val="Grid Table 2 - Accent 3"/>
-    <w:basedOn w:val="665"/>
+    <w:basedOn w:val="889"/>
     <w:uiPriority w:val="99"/>
     <w:pPr>
       <w:pBdr/>
@@ -5565,9 +5726,9 @@
       </w:tcPr>
     </w:tblStylePr>
   </w:style>
-  <w:style w:type="table" w:styleId="30">
+  <w:style w:type="table" w:styleId="721">
     <w:name w:val="Grid Table 2 - Accent 4"/>
-    <w:basedOn w:val="665"/>
+    <w:basedOn w:val="889"/>
     <w:uiPriority w:val="99"/>
     <w:pPr>
       <w:pBdr/>
@@ -5797,9 +5958,9 @@
       </w:tcPr>
     </w:tblStylePr>
   </w:style>
-  <w:style w:type="table" w:styleId="31">
+  <w:style w:type="table" w:styleId="722">
     <w:name w:val="Grid Table 2 - Accent 5"/>
-    <w:basedOn w:val="665"/>
+    <w:basedOn w:val="889"/>
     <w:uiPriority w:val="99"/>
     <w:pPr>
       <w:pBdr/>
@@ -6029,9 +6190,9 @@
       </w:tcPr>
     </w:tblStylePr>
   </w:style>
-  <w:style w:type="table" w:styleId="32">
+  <w:style w:type="table" w:styleId="723">
     <w:name w:val="Grid Table 2 - Accent 6"/>
-    <w:basedOn w:val="665"/>
+    <w:basedOn w:val="889"/>
     <w:uiPriority w:val="99"/>
     <w:pPr>
       <w:pBdr/>
@@ -6261,9 +6422,9 @@
       </w:tcPr>
     </w:tblStylePr>
   </w:style>
-  <w:style w:type="table" w:styleId="33">
+  <w:style w:type="table" w:styleId="724">
     <w:name w:val="Grid Table 3"/>
-    <w:basedOn w:val="665"/>
+    <w:basedOn w:val="889"/>
     <w:uiPriority w:val="99"/>
     <w:pPr>
       <w:pBdr/>
@@ -6362,29 +6523,6 @@
         <w:tblBorders/>
       </w:tblPr>
       <w:tcPr>
-        <w:shd w:color="ffffff"/>
-        <w:tcBorders>
-          <w:top w:val="none" w:color="000000" w:sz="4" w:space="0"/>
-          <w:left w:val="none" w:color="000000" w:sz="4" w:space="0"/>
-          <w:bottom w:val="none" w:color="000000" w:sz="4" w:space="0"/>
-          <w:right w:val="none" w:color="000000" w:sz="4" w:space="0"/>
-        </w:tcBorders>
-      </w:tcPr>
-    </w:tblStylePr>
-    <w:tblStylePr w:type="firstRow">
-      <w:rPr>
-        <w:b/>
-        <w:color w:val="404040"/>
-      </w:rPr>
-      <w:pPr>
-        <w:pBdr/>
-        <w:spacing/>
-        <w:ind/>
-      </w:pPr>
-      <w:tblPr>
-        <w:tblBorders/>
-      </w:tblPr>
-      <w:tcPr>
         <w:shd w:val="clear" w:color="ffffff"/>
         <w:tcBorders>
           <w:top w:val="none" w:color="000000" w:sz="4" w:space="0"/>
@@ -6394,30 +6532,7 @@
         </w:tcBorders>
       </w:tcPr>
     </w:tblStylePr>
-    <w:tblStylePr w:type="lastCol">
-      <w:rPr>
-        <w:i/>
-        <w:color w:val="404040"/>
-      </w:rPr>
-      <w:pPr>
-        <w:pBdr/>
-        <w:spacing/>
-        <w:ind/>
-      </w:pPr>
-      <w:tblPr>
-        <w:tblBorders/>
-      </w:tblPr>
-      <w:tcPr>
-        <w:shd w:color="ffffff"/>
-        <w:tcBorders>
-          <w:top w:val="none" w:color="000000" w:sz="4" w:space="0"/>
-          <w:left w:val="none" w:color="000000" w:sz="4" w:space="0"/>
-          <w:bottom w:val="none" w:color="000000" w:sz="4" w:space="0"/>
-          <w:right w:val="none" w:color="000000" w:sz="4" w:space="0"/>
-        </w:tcBorders>
-      </w:tcPr>
-    </w:tblStylePr>
-    <w:tblStylePr w:type="lastRow">
+    <w:tblStylePr w:type="firstRow">
       <w:rPr>
         <w:b/>
         <w:color w:val="404040"/>
@@ -6440,6 +6555,52 @@
         </w:tcBorders>
       </w:tcPr>
     </w:tblStylePr>
+    <w:tblStylePr w:type="lastCol">
+      <w:rPr>
+        <w:i/>
+        <w:color w:val="404040"/>
+      </w:rPr>
+      <w:pPr>
+        <w:pBdr/>
+        <w:spacing/>
+        <w:ind/>
+      </w:pPr>
+      <w:tblPr>
+        <w:tblBorders/>
+      </w:tblPr>
+      <w:tcPr>
+        <w:shd w:val="clear" w:color="ffffff"/>
+        <w:tcBorders>
+          <w:top w:val="none" w:color="000000" w:sz="4" w:space="0"/>
+          <w:left w:val="none" w:color="000000" w:sz="4" w:space="0"/>
+          <w:bottom w:val="none" w:color="000000" w:sz="4" w:space="0"/>
+          <w:right w:val="none" w:color="000000" w:sz="4" w:space="0"/>
+        </w:tcBorders>
+      </w:tcPr>
+    </w:tblStylePr>
+    <w:tblStylePr w:type="lastRow">
+      <w:rPr>
+        <w:b/>
+        <w:color w:val="404040"/>
+      </w:rPr>
+      <w:pPr>
+        <w:pBdr/>
+        <w:spacing/>
+        <w:ind/>
+      </w:pPr>
+      <w:tblPr>
+        <w:tblBorders/>
+      </w:tblPr>
+      <w:tcPr>
+        <w:shd w:val="clear" w:color="ffffff"/>
+        <w:tcBorders>
+          <w:top w:val="none" w:color="000000" w:sz="4" w:space="0"/>
+          <w:left w:val="none" w:color="000000" w:sz="4" w:space="0"/>
+          <w:bottom w:val="none" w:color="000000" w:sz="4" w:space="0"/>
+          <w:right w:val="none" w:color="000000" w:sz="4" w:space="0"/>
+        </w:tcBorders>
+      </w:tcPr>
+    </w:tblStylePr>
     <w:tblStylePr w:type="nwCell">
       <w:pPr>
         <w:pBdr/>
@@ -6506,9 +6667,9 @@
       </w:tcPr>
     </w:tblStylePr>
   </w:style>
-  <w:style w:type="table" w:styleId="34">
+  <w:style w:type="table" w:styleId="725">
     <w:name w:val="Grid Table 3 - Accent 1"/>
-    <w:basedOn w:val="665"/>
+    <w:basedOn w:val="889"/>
     <w:uiPriority w:val="99"/>
     <w:pPr>
       <w:pBdr/>
@@ -6607,29 +6768,6 @@
         <w:tblBorders/>
       </w:tblPr>
       <w:tcPr>
-        <w:shd w:color="ffffff"/>
-        <w:tcBorders>
-          <w:top w:val="none" w:color="000000" w:sz="4" w:space="0"/>
-          <w:left w:val="none" w:color="000000" w:sz="4" w:space="0"/>
-          <w:bottom w:val="none" w:color="000000" w:sz="4" w:space="0"/>
-          <w:right w:val="none" w:color="000000" w:sz="4" w:space="0"/>
-        </w:tcBorders>
-      </w:tcPr>
-    </w:tblStylePr>
-    <w:tblStylePr w:type="firstRow">
-      <w:rPr>
-        <w:b/>
-        <w:color w:val="404040"/>
-      </w:rPr>
-      <w:pPr>
-        <w:pBdr/>
-        <w:spacing/>
-        <w:ind/>
-      </w:pPr>
-      <w:tblPr>
-        <w:tblBorders/>
-      </w:tblPr>
-      <w:tcPr>
         <w:shd w:val="clear" w:color="ffffff"/>
         <w:tcBorders>
           <w:top w:val="none" w:color="000000" w:sz="4" w:space="0"/>
@@ -6639,30 +6777,7 @@
         </w:tcBorders>
       </w:tcPr>
     </w:tblStylePr>
-    <w:tblStylePr w:type="lastCol">
-      <w:rPr>
-        <w:i/>
-        <w:color w:val="404040"/>
-      </w:rPr>
-      <w:pPr>
-        <w:pBdr/>
-        <w:spacing/>
-        <w:ind/>
-      </w:pPr>
-      <w:tblPr>
-        <w:tblBorders/>
-      </w:tblPr>
-      <w:tcPr>
-        <w:shd w:color="ffffff"/>
-        <w:tcBorders>
-          <w:top w:val="none" w:color="000000" w:sz="4" w:space="0"/>
-          <w:left w:val="none" w:color="000000" w:sz="4" w:space="0"/>
-          <w:bottom w:val="none" w:color="000000" w:sz="4" w:space="0"/>
-          <w:right w:val="none" w:color="000000" w:sz="4" w:space="0"/>
-        </w:tcBorders>
-      </w:tcPr>
-    </w:tblStylePr>
-    <w:tblStylePr w:type="lastRow">
+    <w:tblStylePr w:type="firstRow">
       <w:rPr>
         <w:b/>
         <w:color w:val="404040"/>
@@ -6685,6 +6800,52 @@
         </w:tcBorders>
       </w:tcPr>
     </w:tblStylePr>
+    <w:tblStylePr w:type="lastCol">
+      <w:rPr>
+        <w:i/>
+        <w:color w:val="404040"/>
+      </w:rPr>
+      <w:pPr>
+        <w:pBdr/>
+        <w:spacing/>
+        <w:ind/>
+      </w:pPr>
+      <w:tblPr>
+        <w:tblBorders/>
+      </w:tblPr>
+      <w:tcPr>
+        <w:shd w:val="clear" w:color="ffffff"/>
+        <w:tcBorders>
+          <w:top w:val="none" w:color="000000" w:sz="4" w:space="0"/>
+          <w:left w:val="none" w:color="000000" w:sz="4" w:space="0"/>
+          <w:bottom w:val="none" w:color="000000" w:sz="4" w:space="0"/>
+          <w:right w:val="none" w:color="000000" w:sz="4" w:space="0"/>
+        </w:tcBorders>
+      </w:tcPr>
+    </w:tblStylePr>
+    <w:tblStylePr w:type="lastRow">
+      <w:rPr>
+        <w:b/>
+        <w:color w:val="404040"/>
+      </w:rPr>
+      <w:pPr>
+        <w:pBdr/>
+        <w:spacing/>
+        <w:ind/>
+      </w:pPr>
+      <w:tblPr>
+        <w:tblBorders/>
+      </w:tblPr>
+      <w:tcPr>
+        <w:shd w:val="clear" w:color="ffffff"/>
+        <w:tcBorders>
+          <w:top w:val="none" w:color="000000" w:sz="4" w:space="0"/>
+          <w:left w:val="none" w:color="000000" w:sz="4" w:space="0"/>
+          <w:bottom w:val="none" w:color="000000" w:sz="4" w:space="0"/>
+          <w:right w:val="none" w:color="000000" w:sz="4" w:space="0"/>
+        </w:tcBorders>
+      </w:tcPr>
+    </w:tblStylePr>
     <w:tblStylePr w:type="nwCell">
       <w:pPr>
         <w:pBdr/>
@@ -6751,9 +6912,9 @@
       </w:tcPr>
     </w:tblStylePr>
   </w:style>
-  <w:style w:type="table" w:styleId="35">
+  <w:style w:type="table" w:styleId="726">
     <w:name w:val="Grid Table 3 - Accent 2"/>
-    <w:basedOn w:val="665"/>
+    <w:basedOn w:val="889"/>
     <w:uiPriority w:val="99"/>
     <w:pPr>
       <w:pBdr/>
@@ -6852,29 +7013,6 @@
         <w:tblBorders/>
       </w:tblPr>
       <w:tcPr>
-        <w:shd w:color="ffffff"/>
-        <w:tcBorders>
-          <w:top w:val="none" w:color="000000" w:sz="4" w:space="0"/>
-          <w:left w:val="none" w:color="000000" w:sz="4" w:space="0"/>
-          <w:bottom w:val="none" w:color="000000" w:sz="4" w:space="0"/>
-          <w:right w:val="none" w:color="000000" w:sz="4" w:space="0"/>
-        </w:tcBorders>
-      </w:tcPr>
-    </w:tblStylePr>
-    <w:tblStylePr w:type="firstRow">
-      <w:rPr>
-        <w:b/>
-        <w:color w:val="404040"/>
-      </w:rPr>
-      <w:pPr>
-        <w:pBdr/>
-        <w:spacing/>
-        <w:ind/>
-      </w:pPr>
-      <w:tblPr>
-        <w:tblBorders/>
-      </w:tblPr>
-      <w:tcPr>
         <w:shd w:val="clear" w:color="ffffff"/>
         <w:tcBorders>
           <w:top w:val="none" w:color="000000" w:sz="4" w:space="0"/>
@@ -6884,30 +7022,7 @@
         </w:tcBorders>
       </w:tcPr>
     </w:tblStylePr>
-    <w:tblStylePr w:type="lastCol">
-      <w:rPr>
-        <w:i/>
-        <w:color w:val="404040"/>
-      </w:rPr>
-      <w:pPr>
-        <w:pBdr/>
-        <w:spacing/>
-        <w:ind/>
-      </w:pPr>
-      <w:tblPr>
-        <w:tblBorders/>
-      </w:tblPr>
-      <w:tcPr>
-        <w:shd w:color="ffffff"/>
-        <w:tcBorders>
-          <w:top w:val="none" w:color="000000" w:sz="4" w:space="0"/>
-          <w:left w:val="none" w:color="000000" w:sz="4" w:space="0"/>
-          <w:bottom w:val="none" w:color="000000" w:sz="4" w:space="0"/>
-          <w:right w:val="none" w:color="000000" w:sz="4" w:space="0"/>
-        </w:tcBorders>
-      </w:tcPr>
-    </w:tblStylePr>
-    <w:tblStylePr w:type="lastRow">
+    <w:tblStylePr w:type="firstRow">
       <w:rPr>
         <w:b/>
         <w:color w:val="404040"/>
@@ -6930,6 +7045,52 @@
         </w:tcBorders>
       </w:tcPr>
     </w:tblStylePr>
+    <w:tblStylePr w:type="lastCol">
+      <w:rPr>
+        <w:i/>
+        <w:color w:val="404040"/>
+      </w:rPr>
+      <w:pPr>
+        <w:pBdr/>
+        <w:spacing/>
+        <w:ind/>
+      </w:pPr>
+      <w:tblPr>
+        <w:tblBorders/>
+      </w:tblPr>
+      <w:tcPr>
+        <w:shd w:val="clear" w:color="ffffff"/>
+        <w:tcBorders>
+          <w:top w:val="none" w:color="000000" w:sz="4" w:space="0"/>
+          <w:left w:val="none" w:color="000000" w:sz="4" w:space="0"/>
+          <w:bottom w:val="none" w:color="000000" w:sz="4" w:space="0"/>
+          <w:right w:val="none" w:color="000000" w:sz="4" w:space="0"/>
+        </w:tcBorders>
+      </w:tcPr>
+    </w:tblStylePr>
+    <w:tblStylePr w:type="lastRow">
+      <w:rPr>
+        <w:b/>
+        <w:color w:val="404040"/>
+      </w:rPr>
+      <w:pPr>
+        <w:pBdr/>
+        <w:spacing/>
+        <w:ind/>
+      </w:pPr>
+      <w:tblPr>
+        <w:tblBorders/>
+      </w:tblPr>
+      <w:tcPr>
+        <w:shd w:val="clear" w:color="ffffff"/>
+        <w:tcBorders>
+          <w:top w:val="none" w:color="000000" w:sz="4" w:space="0"/>
+          <w:left w:val="none" w:color="000000" w:sz="4" w:space="0"/>
+          <w:bottom w:val="none" w:color="000000" w:sz="4" w:space="0"/>
+          <w:right w:val="none" w:color="000000" w:sz="4" w:space="0"/>
+        </w:tcBorders>
+      </w:tcPr>
+    </w:tblStylePr>
     <w:tblStylePr w:type="nwCell">
       <w:pPr>
         <w:pBdr/>
@@ -6996,9 +7157,9 @@
       </w:tcPr>
     </w:tblStylePr>
   </w:style>
-  <w:style w:type="table" w:styleId="36">
+  <w:style w:type="table" w:styleId="727">
     <w:name w:val="Grid Table 3 - Accent 3"/>
-    <w:basedOn w:val="665"/>
+    <w:basedOn w:val="889"/>
     <w:uiPriority w:val="99"/>
     <w:pPr>
       <w:pBdr/>
@@ -7097,29 +7258,6 @@
         <w:tblBorders/>
       </w:tblPr>
       <w:tcPr>
-        <w:shd w:color="ffffff"/>
-        <w:tcBorders>
-          <w:top w:val="none" w:color="000000" w:sz="4" w:space="0"/>
-          <w:left w:val="none" w:color="000000" w:sz="4" w:space="0"/>
-          <w:bottom w:val="none" w:color="000000" w:sz="4" w:space="0"/>
-          <w:right w:val="none" w:color="000000" w:sz="4" w:space="0"/>
-        </w:tcBorders>
-      </w:tcPr>
-    </w:tblStylePr>
-    <w:tblStylePr w:type="firstRow">
-      <w:rPr>
-        <w:b/>
-        <w:color w:val="404040"/>
-      </w:rPr>
-      <w:pPr>
-        <w:pBdr/>
-        <w:spacing/>
-        <w:ind/>
-      </w:pPr>
-      <w:tblPr>
-        <w:tblBorders/>
-      </w:tblPr>
-      <w:tcPr>
         <w:shd w:val="clear" w:color="ffffff"/>
         <w:tcBorders>
           <w:top w:val="none" w:color="000000" w:sz="4" w:space="0"/>
@@ -7129,30 +7267,7 @@
         </w:tcBorders>
       </w:tcPr>
     </w:tblStylePr>
-    <w:tblStylePr w:type="lastCol">
-      <w:rPr>
-        <w:i/>
-        <w:color w:val="404040"/>
-      </w:rPr>
-      <w:pPr>
-        <w:pBdr/>
-        <w:spacing/>
-        <w:ind/>
-      </w:pPr>
-      <w:tblPr>
-        <w:tblBorders/>
-      </w:tblPr>
-      <w:tcPr>
-        <w:shd w:color="ffffff"/>
-        <w:tcBorders>
-          <w:top w:val="none" w:color="000000" w:sz="4" w:space="0"/>
-          <w:left w:val="none" w:color="000000" w:sz="4" w:space="0"/>
-          <w:bottom w:val="none" w:color="000000" w:sz="4" w:space="0"/>
-          <w:right w:val="none" w:color="000000" w:sz="4" w:space="0"/>
-        </w:tcBorders>
-      </w:tcPr>
-    </w:tblStylePr>
-    <w:tblStylePr w:type="lastRow">
+    <w:tblStylePr w:type="firstRow">
       <w:rPr>
         <w:b/>
         <w:color w:val="404040"/>
@@ -7175,6 +7290,52 @@
         </w:tcBorders>
       </w:tcPr>
     </w:tblStylePr>
+    <w:tblStylePr w:type="lastCol">
+      <w:rPr>
+        <w:i/>
+        <w:color w:val="404040"/>
+      </w:rPr>
+      <w:pPr>
+        <w:pBdr/>
+        <w:spacing/>
+        <w:ind/>
+      </w:pPr>
+      <w:tblPr>
+        <w:tblBorders/>
+      </w:tblPr>
+      <w:tcPr>
+        <w:shd w:val="clear" w:color="ffffff"/>
+        <w:tcBorders>
+          <w:top w:val="none" w:color="000000" w:sz="4" w:space="0"/>
+          <w:left w:val="none" w:color="000000" w:sz="4" w:space="0"/>
+          <w:bottom w:val="none" w:color="000000" w:sz="4" w:space="0"/>
+          <w:right w:val="none" w:color="000000" w:sz="4" w:space="0"/>
+        </w:tcBorders>
+      </w:tcPr>
+    </w:tblStylePr>
+    <w:tblStylePr w:type="lastRow">
+      <w:rPr>
+        <w:b/>
+        <w:color w:val="404040"/>
+      </w:rPr>
+      <w:pPr>
+        <w:pBdr/>
+        <w:spacing/>
+        <w:ind/>
+      </w:pPr>
+      <w:tblPr>
+        <w:tblBorders/>
+      </w:tblPr>
+      <w:tcPr>
+        <w:shd w:val="clear" w:color="ffffff"/>
+        <w:tcBorders>
+          <w:top w:val="none" w:color="000000" w:sz="4" w:space="0"/>
+          <w:left w:val="none" w:color="000000" w:sz="4" w:space="0"/>
+          <w:bottom w:val="none" w:color="000000" w:sz="4" w:space="0"/>
+          <w:right w:val="none" w:color="000000" w:sz="4" w:space="0"/>
+        </w:tcBorders>
+      </w:tcPr>
+    </w:tblStylePr>
     <w:tblStylePr w:type="nwCell">
       <w:pPr>
         <w:pBdr/>
@@ -7241,9 +7402,9 @@
       </w:tcPr>
     </w:tblStylePr>
   </w:style>
-  <w:style w:type="table" w:styleId="37">
+  <w:style w:type="table" w:styleId="728">
     <w:name w:val="Grid Table 3 - Accent 4"/>
-    <w:basedOn w:val="665"/>
+    <w:basedOn w:val="889"/>
     <w:uiPriority w:val="99"/>
     <w:pPr>
       <w:pBdr/>
@@ -7342,29 +7503,6 @@
         <w:tblBorders/>
       </w:tblPr>
       <w:tcPr>
-        <w:shd w:color="ffffff"/>
-        <w:tcBorders>
-          <w:top w:val="none" w:color="000000" w:sz="4" w:space="0"/>
-          <w:left w:val="none" w:color="000000" w:sz="4" w:space="0"/>
-          <w:bottom w:val="none" w:color="000000" w:sz="4" w:space="0"/>
-          <w:right w:val="none" w:color="000000" w:sz="4" w:space="0"/>
-        </w:tcBorders>
-      </w:tcPr>
-    </w:tblStylePr>
-    <w:tblStylePr w:type="firstRow">
-      <w:rPr>
-        <w:b/>
-        <w:color w:val="404040"/>
-      </w:rPr>
-      <w:pPr>
-        <w:pBdr/>
-        <w:spacing/>
-        <w:ind/>
-      </w:pPr>
-      <w:tblPr>
-        <w:tblBorders/>
-      </w:tblPr>
-      <w:tcPr>
         <w:shd w:val="clear" w:color="ffffff"/>
         <w:tcBorders>
           <w:top w:val="none" w:color="000000" w:sz="4" w:space="0"/>
@@ -7374,30 +7512,7 @@
         </w:tcBorders>
       </w:tcPr>
     </w:tblStylePr>
-    <w:tblStylePr w:type="lastCol">
-      <w:rPr>
-        <w:i/>
-        <w:color w:val="404040"/>
-      </w:rPr>
-      <w:pPr>
-        <w:pBdr/>
-        <w:spacing/>
-        <w:ind/>
-      </w:pPr>
-      <w:tblPr>
-        <w:tblBorders/>
-      </w:tblPr>
-      <w:tcPr>
-        <w:shd w:color="ffffff"/>
-        <w:tcBorders>
-          <w:top w:val="none" w:color="000000" w:sz="4" w:space="0"/>
-          <w:left w:val="none" w:color="000000" w:sz="4" w:space="0"/>
-          <w:bottom w:val="none" w:color="000000" w:sz="4" w:space="0"/>
-          <w:right w:val="none" w:color="000000" w:sz="4" w:space="0"/>
-        </w:tcBorders>
-      </w:tcPr>
-    </w:tblStylePr>
-    <w:tblStylePr w:type="lastRow">
+    <w:tblStylePr w:type="firstRow">
       <w:rPr>
         <w:b/>
         <w:color w:val="404040"/>
@@ -7420,6 +7535,52 @@
         </w:tcBorders>
       </w:tcPr>
     </w:tblStylePr>
+    <w:tblStylePr w:type="lastCol">
+      <w:rPr>
+        <w:i/>
+        <w:color w:val="404040"/>
+      </w:rPr>
+      <w:pPr>
+        <w:pBdr/>
+        <w:spacing/>
+        <w:ind/>
+      </w:pPr>
+      <w:tblPr>
+        <w:tblBorders/>
+      </w:tblPr>
+      <w:tcPr>
+        <w:shd w:val="clear" w:color="ffffff"/>
+        <w:tcBorders>
+          <w:top w:val="none" w:color="000000" w:sz="4" w:space="0"/>
+          <w:left w:val="none" w:color="000000" w:sz="4" w:space="0"/>
+          <w:bottom w:val="none" w:color="000000" w:sz="4" w:space="0"/>
+          <w:right w:val="none" w:color="000000" w:sz="4" w:space="0"/>
+        </w:tcBorders>
+      </w:tcPr>
+    </w:tblStylePr>
+    <w:tblStylePr w:type="lastRow">
+      <w:rPr>
+        <w:b/>
+        <w:color w:val="404040"/>
+      </w:rPr>
+      <w:pPr>
+        <w:pBdr/>
+        <w:spacing/>
+        <w:ind/>
+      </w:pPr>
+      <w:tblPr>
+        <w:tblBorders/>
+      </w:tblPr>
+      <w:tcPr>
+        <w:shd w:val="clear" w:color="ffffff"/>
+        <w:tcBorders>
+          <w:top w:val="none" w:color="000000" w:sz="4" w:space="0"/>
+          <w:left w:val="none" w:color="000000" w:sz="4" w:space="0"/>
+          <w:bottom w:val="none" w:color="000000" w:sz="4" w:space="0"/>
+          <w:right w:val="none" w:color="000000" w:sz="4" w:space="0"/>
+        </w:tcBorders>
+      </w:tcPr>
+    </w:tblStylePr>
     <w:tblStylePr w:type="nwCell">
       <w:pPr>
         <w:pBdr/>
@@ -7486,9 +7647,9 @@
       </w:tcPr>
     </w:tblStylePr>
   </w:style>
-  <w:style w:type="table" w:styleId="38">
+  <w:style w:type="table" w:styleId="729">
     <w:name w:val="Grid Table 3 - Accent 5"/>
-    <w:basedOn w:val="665"/>
+    <w:basedOn w:val="889"/>
     <w:uiPriority w:val="99"/>
     <w:pPr>
       <w:pBdr/>
@@ -7587,29 +7748,6 @@
         <w:tblBorders/>
       </w:tblPr>
       <w:tcPr>
-        <w:shd w:color="ffffff"/>
-        <w:tcBorders>
-          <w:top w:val="none" w:color="000000" w:sz="4" w:space="0"/>
-          <w:left w:val="none" w:color="000000" w:sz="4" w:space="0"/>
-          <w:bottom w:val="none" w:color="000000" w:sz="4" w:space="0"/>
-          <w:right w:val="none" w:color="000000" w:sz="4" w:space="0"/>
-        </w:tcBorders>
-      </w:tcPr>
-    </w:tblStylePr>
-    <w:tblStylePr w:type="firstRow">
-      <w:rPr>
-        <w:b/>
-        <w:color w:val="404040"/>
-      </w:rPr>
-      <w:pPr>
-        <w:pBdr/>
-        <w:spacing/>
-        <w:ind/>
-      </w:pPr>
-      <w:tblPr>
-        <w:tblBorders/>
-      </w:tblPr>
-      <w:tcPr>
         <w:shd w:val="clear" w:color="ffffff"/>
         <w:tcBorders>
           <w:top w:val="none" w:color="000000" w:sz="4" w:space="0"/>
@@ -7619,30 +7757,7 @@
         </w:tcBorders>
       </w:tcPr>
     </w:tblStylePr>
-    <w:tblStylePr w:type="lastCol">
-      <w:rPr>
-        <w:i/>
-        <w:color w:val="404040"/>
-      </w:rPr>
-      <w:pPr>
-        <w:pBdr/>
-        <w:spacing/>
-        <w:ind/>
-      </w:pPr>
-      <w:tblPr>
-        <w:tblBorders/>
-      </w:tblPr>
-      <w:tcPr>
-        <w:shd w:color="ffffff"/>
-        <w:tcBorders>
-          <w:top w:val="none" w:color="000000" w:sz="4" w:space="0"/>
-          <w:left w:val="none" w:color="000000" w:sz="4" w:space="0"/>
-          <w:bottom w:val="none" w:color="000000" w:sz="4" w:space="0"/>
-          <w:right w:val="none" w:color="000000" w:sz="4" w:space="0"/>
-        </w:tcBorders>
-      </w:tcPr>
-    </w:tblStylePr>
-    <w:tblStylePr w:type="lastRow">
+    <w:tblStylePr w:type="firstRow">
       <w:rPr>
         <w:b/>
         <w:color w:val="404040"/>
@@ -7665,6 +7780,52 @@
         </w:tcBorders>
       </w:tcPr>
     </w:tblStylePr>
+    <w:tblStylePr w:type="lastCol">
+      <w:rPr>
+        <w:i/>
+        <w:color w:val="404040"/>
+      </w:rPr>
+      <w:pPr>
+        <w:pBdr/>
+        <w:spacing/>
+        <w:ind/>
+      </w:pPr>
+      <w:tblPr>
+        <w:tblBorders/>
+      </w:tblPr>
+      <w:tcPr>
+        <w:shd w:val="clear" w:color="ffffff"/>
+        <w:tcBorders>
+          <w:top w:val="none" w:color="000000" w:sz="4" w:space="0"/>
+          <w:left w:val="none" w:color="000000" w:sz="4" w:space="0"/>
+          <w:bottom w:val="none" w:color="000000" w:sz="4" w:space="0"/>
+          <w:right w:val="none" w:color="000000" w:sz="4" w:space="0"/>
+        </w:tcBorders>
+      </w:tcPr>
+    </w:tblStylePr>
+    <w:tblStylePr w:type="lastRow">
+      <w:rPr>
+        <w:b/>
+        <w:color w:val="404040"/>
+      </w:rPr>
+      <w:pPr>
+        <w:pBdr/>
+        <w:spacing/>
+        <w:ind/>
+      </w:pPr>
+      <w:tblPr>
+        <w:tblBorders/>
+      </w:tblPr>
+      <w:tcPr>
+        <w:shd w:val="clear" w:color="ffffff"/>
+        <w:tcBorders>
+          <w:top w:val="none" w:color="000000" w:sz="4" w:space="0"/>
+          <w:left w:val="none" w:color="000000" w:sz="4" w:space="0"/>
+          <w:bottom w:val="none" w:color="000000" w:sz="4" w:space="0"/>
+          <w:right w:val="none" w:color="000000" w:sz="4" w:space="0"/>
+        </w:tcBorders>
+      </w:tcPr>
+    </w:tblStylePr>
     <w:tblStylePr w:type="nwCell">
       <w:pPr>
         <w:pBdr/>
@@ -7731,9 +7892,9 @@
       </w:tcPr>
     </w:tblStylePr>
   </w:style>
-  <w:style w:type="table" w:styleId="39">
+  <w:style w:type="table" w:styleId="730">
     <w:name w:val="Grid Table 3 - Accent 6"/>
-    <w:basedOn w:val="665"/>
+    <w:basedOn w:val="889"/>
     <w:uiPriority w:val="99"/>
     <w:pPr>
       <w:pBdr/>
@@ -7832,29 +7993,6 @@
         <w:tblBorders/>
       </w:tblPr>
       <w:tcPr>
-        <w:shd w:color="ffffff"/>
-        <w:tcBorders>
-          <w:top w:val="none" w:color="000000" w:sz="4" w:space="0"/>
-          <w:left w:val="none" w:color="000000" w:sz="4" w:space="0"/>
-          <w:bottom w:val="none" w:color="000000" w:sz="4" w:space="0"/>
-          <w:right w:val="none" w:color="000000" w:sz="4" w:space="0"/>
-        </w:tcBorders>
-      </w:tcPr>
-    </w:tblStylePr>
-    <w:tblStylePr w:type="firstRow">
-      <w:rPr>
-        <w:b/>
-        <w:color w:val="404040"/>
-      </w:rPr>
-      <w:pPr>
-        <w:pBdr/>
-        <w:spacing/>
-        <w:ind/>
-      </w:pPr>
-      <w:tblPr>
-        <w:tblBorders/>
-      </w:tblPr>
-      <w:tcPr>
         <w:shd w:val="clear" w:color="ffffff"/>
         <w:tcBorders>
           <w:top w:val="none" w:color="000000" w:sz="4" w:space="0"/>
@@ -7864,30 +8002,7 @@
         </w:tcBorders>
       </w:tcPr>
     </w:tblStylePr>
-    <w:tblStylePr w:type="lastCol">
-      <w:rPr>
-        <w:i/>
-        <w:color w:val="404040"/>
-      </w:rPr>
-      <w:pPr>
-        <w:pBdr/>
-        <w:spacing/>
-        <w:ind/>
-      </w:pPr>
-      <w:tblPr>
-        <w:tblBorders/>
-      </w:tblPr>
-      <w:tcPr>
-        <w:shd w:color="ffffff"/>
-        <w:tcBorders>
-          <w:top w:val="none" w:color="000000" w:sz="4" w:space="0"/>
-          <w:left w:val="none" w:color="000000" w:sz="4" w:space="0"/>
-          <w:bottom w:val="none" w:color="000000" w:sz="4" w:space="0"/>
-          <w:right w:val="none" w:color="000000" w:sz="4" w:space="0"/>
-        </w:tcBorders>
-      </w:tcPr>
-    </w:tblStylePr>
-    <w:tblStylePr w:type="lastRow">
+    <w:tblStylePr w:type="firstRow">
       <w:rPr>
         <w:b/>
         <w:color w:val="404040"/>
@@ -7910,6 +8025,52 @@
         </w:tcBorders>
       </w:tcPr>
     </w:tblStylePr>
+    <w:tblStylePr w:type="lastCol">
+      <w:rPr>
+        <w:i/>
+        <w:color w:val="404040"/>
+      </w:rPr>
+      <w:pPr>
+        <w:pBdr/>
+        <w:spacing/>
+        <w:ind/>
+      </w:pPr>
+      <w:tblPr>
+        <w:tblBorders/>
+      </w:tblPr>
+      <w:tcPr>
+        <w:shd w:val="clear" w:color="ffffff"/>
+        <w:tcBorders>
+          <w:top w:val="none" w:color="000000" w:sz="4" w:space="0"/>
+          <w:left w:val="none" w:color="000000" w:sz="4" w:space="0"/>
+          <w:bottom w:val="none" w:color="000000" w:sz="4" w:space="0"/>
+          <w:right w:val="none" w:color="000000" w:sz="4" w:space="0"/>
+        </w:tcBorders>
+      </w:tcPr>
+    </w:tblStylePr>
+    <w:tblStylePr w:type="lastRow">
+      <w:rPr>
+        <w:b/>
+        <w:color w:val="404040"/>
+      </w:rPr>
+      <w:pPr>
+        <w:pBdr/>
+        <w:spacing/>
+        <w:ind/>
+      </w:pPr>
+      <w:tblPr>
+        <w:tblBorders/>
+      </w:tblPr>
+      <w:tcPr>
+        <w:shd w:val="clear" w:color="ffffff"/>
+        <w:tcBorders>
+          <w:top w:val="none" w:color="000000" w:sz="4" w:space="0"/>
+          <w:left w:val="none" w:color="000000" w:sz="4" w:space="0"/>
+          <w:bottom w:val="none" w:color="000000" w:sz="4" w:space="0"/>
+          <w:right w:val="none" w:color="000000" w:sz="4" w:space="0"/>
+        </w:tcBorders>
+      </w:tcPr>
+    </w:tblStylePr>
     <w:tblStylePr w:type="nwCell">
       <w:pPr>
         <w:pBdr/>
@@ -7976,9 +8137,9 @@
       </w:tcPr>
     </w:tblStylePr>
   </w:style>
-  <w:style w:type="table" w:styleId="40">
+  <w:style w:type="table" w:styleId="731">
     <w:name w:val="Grid Table 4"/>
-    <w:basedOn w:val="665"/>
+    <w:basedOn w:val="889"/>
     <w:uiPriority w:val="59"/>
     <w:pPr>
       <w:pBdr/>
@@ -8209,9 +8370,9 @@
       </w:tcPr>
     </w:tblStylePr>
   </w:style>
-  <w:style w:type="table" w:styleId="41">
+  <w:style w:type="table" w:styleId="732">
     <w:name w:val="Grid Table 4 - Accent 1"/>
-    <w:basedOn w:val="665"/>
+    <w:basedOn w:val="889"/>
     <w:uiPriority w:val="59"/>
     <w:pPr>
       <w:pBdr/>
@@ -8442,9 +8603,9 @@
       </w:tcPr>
     </w:tblStylePr>
   </w:style>
-  <w:style w:type="table" w:styleId="42">
+  <w:style w:type="table" w:styleId="733">
     <w:name w:val="Grid Table 4 - Accent 2"/>
-    <w:basedOn w:val="665"/>
+    <w:basedOn w:val="889"/>
     <w:uiPriority w:val="59"/>
     <w:pPr>
       <w:pBdr/>
@@ -8675,9 +8836,9 @@
       </w:tcPr>
     </w:tblStylePr>
   </w:style>
-  <w:style w:type="table" w:styleId="43">
+  <w:style w:type="table" w:styleId="734">
     <w:name w:val="Grid Table 4 - Accent 3"/>
-    <w:basedOn w:val="665"/>
+    <w:basedOn w:val="889"/>
     <w:uiPriority w:val="59"/>
     <w:pPr>
       <w:pBdr/>
@@ -8908,9 +9069,9 @@
       </w:tcPr>
     </w:tblStylePr>
   </w:style>
-  <w:style w:type="table" w:styleId="44">
+  <w:style w:type="table" w:styleId="735">
     <w:name w:val="Grid Table 4 - Accent 4"/>
-    <w:basedOn w:val="665"/>
+    <w:basedOn w:val="889"/>
     <w:uiPriority w:val="59"/>
     <w:pPr>
       <w:pBdr/>
@@ -9141,9 +9302,9 @@
       </w:tcPr>
     </w:tblStylePr>
   </w:style>
-  <w:style w:type="table" w:styleId="45">
+  <w:style w:type="table" w:styleId="736">
     <w:name w:val="Grid Table 4 - Accent 5"/>
-    <w:basedOn w:val="665"/>
+    <w:basedOn w:val="889"/>
     <w:uiPriority w:val="59"/>
     <w:pPr>
       <w:pBdr/>
@@ -9374,9 +9535,9 @@
       </w:tcPr>
     </w:tblStylePr>
   </w:style>
-  <w:style w:type="table" w:styleId="46">
+  <w:style w:type="table" w:styleId="737">
     <w:name w:val="Grid Table 4 - Accent 6"/>
-    <w:basedOn w:val="665"/>
+    <w:basedOn w:val="889"/>
     <w:uiPriority w:val="59"/>
     <w:pPr>
       <w:pBdr/>
@@ -9607,9 +9768,9 @@
       </w:tcPr>
     </w:tblStylePr>
   </w:style>
-  <w:style w:type="table" w:styleId="47">
+  <w:style w:type="table" w:styleId="738">
     <w:name w:val="Grid Table 5 Dark"/>
-    <w:basedOn w:val="665"/>
+    <w:basedOn w:val="889"/>
     <w:uiPriority w:val="99"/>
     <w:pPr>
       <w:pBdr/>
@@ -9835,9 +9996,9 @@
       </w:tcPr>
     </w:tblStylePr>
   </w:style>
-  <w:style w:type="table" w:styleId="48">
+  <w:style w:type="table" w:styleId="739">
     <w:name w:val="Grid Table 5 Dark- Accent 1"/>
-    <w:basedOn w:val="665"/>
+    <w:basedOn w:val="889"/>
     <w:uiPriority w:val="99"/>
     <w:pPr>
       <w:pBdr/>
@@ -10063,9 +10224,9 @@
       </w:tcPr>
     </w:tblStylePr>
   </w:style>
-  <w:style w:type="table" w:styleId="49">
+  <w:style w:type="table" w:styleId="740">
     <w:name w:val="Grid Table 5 Dark - Accent 2"/>
-    <w:basedOn w:val="665"/>
+    <w:basedOn w:val="889"/>
     <w:uiPriority w:val="99"/>
     <w:pPr>
       <w:pBdr/>
@@ -10291,9 +10452,9 @@
       </w:tcPr>
     </w:tblStylePr>
   </w:style>
-  <w:style w:type="table" w:styleId="50">
+  <w:style w:type="table" w:styleId="741">
     <w:name w:val="Grid Table 5 Dark - Accent 3"/>
-    <w:basedOn w:val="665"/>
+    <w:basedOn w:val="889"/>
     <w:uiPriority w:val="99"/>
     <w:pPr>
       <w:pBdr/>
@@ -10519,9 +10680,9 @@
       </w:tcPr>
     </w:tblStylePr>
   </w:style>
-  <w:style w:type="table" w:styleId="51">
+  <w:style w:type="table" w:styleId="742">
     <w:name w:val="Grid Table 5 Dark- Accent 4"/>
-    <w:basedOn w:val="665"/>
+    <w:basedOn w:val="889"/>
     <w:uiPriority w:val="99"/>
     <w:pPr>
       <w:pBdr/>
@@ -10747,9 +10908,9 @@
       </w:tcPr>
     </w:tblStylePr>
   </w:style>
-  <w:style w:type="table" w:styleId="52">
+  <w:style w:type="table" w:styleId="743">
     <w:name w:val="Grid Table 5 Dark - Accent 5"/>
-    <w:basedOn w:val="665"/>
+    <w:basedOn w:val="889"/>
     <w:uiPriority w:val="99"/>
     <w:pPr>
       <w:pBdr/>
@@ -10975,9 +11136,9 @@
       </w:tcPr>
     </w:tblStylePr>
   </w:style>
-  <w:style w:type="table" w:styleId="53">
+  <w:style w:type="table" w:styleId="744">
     <w:name w:val="Grid Table 5 Dark - Accent 6"/>
-    <w:basedOn w:val="665"/>
+    <w:basedOn w:val="889"/>
     <w:uiPriority w:val="99"/>
     <w:pPr>
       <w:pBdr/>
@@ -11203,9 +11364,9 @@
       </w:tcPr>
     </w:tblStylePr>
   </w:style>
-  <w:style w:type="table" w:styleId="54">
+  <w:style w:type="table" w:styleId="745">
     <w:name w:val="Grid Table 6 Colorful"/>
-    <w:basedOn w:val="665"/>
+    <w:basedOn w:val="889"/>
     <w:uiPriority w:val="99"/>
     <w:pPr>
       <w:pBdr/>
@@ -11433,9 +11594,9 @@
       </w:tcPr>
     </w:tblStylePr>
   </w:style>
-  <w:style w:type="table" w:styleId="55">
+  <w:style w:type="table" w:styleId="746">
     <w:name w:val="Grid Table 6 Colorful - Accent 1"/>
-    <w:basedOn w:val="665"/>
+    <w:basedOn w:val="889"/>
     <w:uiPriority w:val="99"/>
     <w:pPr>
       <w:pBdr/>
@@ -11663,9 +11824,9 @@
       </w:tcPr>
     </w:tblStylePr>
   </w:style>
-  <w:style w:type="table" w:styleId="56">
+  <w:style w:type="table" w:styleId="747">
     <w:name w:val="Grid Table 6 Colorful - Accent 2"/>
-    <w:basedOn w:val="665"/>
+    <w:basedOn w:val="889"/>
     <w:uiPriority w:val="99"/>
     <w:pPr>
       <w:pBdr/>
@@ -11893,9 +12054,9 @@
       </w:tcPr>
     </w:tblStylePr>
   </w:style>
-  <w:style w:type="table" w:styleId="57">
+  <w:style w:type="table" w:styleId="748">
     <w:name w:val="Grid Table 6 Colorful - Accent 3"/>
-    <w:basedOn w:val="665"/>
+    <w:basedOn w:val="889"/>
     <w:uiPriority w:val="99"/>
     <w:pPr>
       <w:pBdr/>
@@ -12123,9 +12284,9 @@
       </w:tcPr>
     </w:tblStylePr>
   </w:style>
-  <w:style w:type="table" w:styleId="58">
+  <w:style w:type="table" w:styleId="749">
     <w:name w:val="Grid Table 6 Colorful - Accent 4"/>
-    <w:basedOn w:val="665"/>
+    <w:basedOn w:val="889"/>
     <w:uiPriority w:val="99"/>
     <w:pPr>
       <w:pBdr/>
@@ -12353,9 +12514,9 @@
       </w:tcPr>
     </w:tblStylePr>
   </w:style>
-  <w:style w:type="table" w:styleId="59">
+  <w:style w:type="table" w:styleId="750">
     <w:name w:val="Grid Table 6 Colorful - Accent 5"/>
-    <w:basedOn w:val="665"/>
+    <w:basedOn w:val="889"/>
     <w:uiPriority w:val="99"/>
     <w:pPr>
       <w:pBdr/>
@@ -12583,9 +12744,9 @@
       </w:tcPr>
     </w:tblStylePr>
   </w:style>
-  <w:style w:type="table" w:styleId="60">
+  <w:style w:type="table" w:styleId="751">
     <w:name w:val="Grid Table 6 Colorful - Accent 6"/>
-    <w:basedOn w:val="665"/>
+    <w:basedOn w:val="889"/>
     <w:uiPriority w:val="99"/>
     <w:pPr>
       <w:pBdr/>
@@ -12813,9 +12974,9 @@
       </w:tcPr>
     </w:tblStylePr>
   </w:style>
-  <w:style w:type="table" w:styleId="61">
+  <w:style w:type="table" w:styleId="752">
     <w:name w:val="Grid Table 7 Colorful"/>
-    <w:basedOn w:val="665"/>
+    <w:basedOn w:val="889"/>
     <w:uiPriority w:val="99"/>
     <w:pPr>
       <w:pBdr/>
@@ -12917,11 +13078,11 @@
         <w:tblBorders/>
       </w:tblPr>
       <w:tcPr>
-        <w:shd w:color="ffffff"/>
+        <w:shd w:val="clear" w:color="ffffff"/>
         <w:tcBorders>
-          <w:top w:val="none"/>
-          <w:left w:val="none"/>
-          <w:bottom w:val="none"/>
+          <w:top w:val="none" w:color="000000" w:sz="4" w:space="0"/>
+          <w:left w:val="none" w:color="000000" w:sz="4" w:space="0"/>
+          <w:bottom w:val="none" w:color="000000" w:sz="4" w:space="0"/>
           <w:right w:val="single" w:color="000000" w:themeColor="text1" w:themeTint="80" w:sz="4" w:space="0"/>
         </w:tcBorders>
       </w:tcPr>
@@ -12944,10 +13105,10 @@
       <w:tcPr>
         <w:shd w:val="clear" w:color="ffffff" w:themeColor="light1" w:fill="ffffff" w:themeFill="light1"/>
         <w:tcBorders>
-          <w:top w:val="none"/>
-          <w:left w:val="none"/>
+          <w:top w:val="none" w:color="000000" w:sz="4" w:space="0"/>
+          <w:left w:val="none" w:color="000000" w:sz="4" w:space="0"/>
           <w:bottom w:val="single" w:color="000000" w:themeColor="text1" w:themeTint="80" w:sz="4" w:space="0"/>
-          <w:right w:val="none"/>
+          <w:right w:val="none" w:color="000000" w:sz="4" w:space="0"/>
         </w:tcBorders>
       </w:tcPr>
     </w:tblStylePr>
@@ -12967,12 +13128,12 @@
         <w:tblBorders/>
       </w:tblPr>
       <w:tcPr>
-        <w:shd w:color="ffffff"/>
+        <w:shd w:val="clear" w:color="ffffff"/>
         <w:tcBorders>
-          <w:top w:val="none"/>
+          <w:top w:val="none" w:color="000000" w:sz="4" w:space="0"/>
           <w:left w:val="single" w:color="000000" w:themeColor="text1" w:themeTint="80" w:sz="4" w:space="0"/>
-          <w:bottom w:val="none"/>
-          <w:right w:val="none"/>
+          <w:bottom w:val="none" w:color="000000" w:sz="4" w:space="0"/>
+          <w:right w:val="none" w:color="000000" w:sz="4" w:space="0"/>
         </w:tcBorders>
       </w:tcPr>
     </w:tblStylePr>
@@ -12995,9 +13156,9 @@
         <w:shd w:val="clear" w:color="ffffff" w:themeColor="light1" w:fill="ffffff" w:themeFill="light1"/>
         <w:tcBorders>
           <w:top w:val="single" w:color="000000" w:themeColor="text1" w:themeTint="80" w:sz="4" w:space="0"/>
-          <w:left w:val="none"/>
-          <w:bottom w:val="none"/>
-          <w:right w:val="none"/>
+          <w:left w:val="none" w:color="000000" w:sz="4" w:space="0"/>
+          <w:bottom w:val="none" w:color="000000" w:sz="4" w:space="0"/>
+          <w:right w:val="none" w:color="000000" w:sz="4" w:space="0"/>
         </w:tcBorders>
       </w:tcPr>
     </w:tblStylePr>
@@ -13067,9 +13228,9 @@
       </w:tcPr>
     </w:tblStylePr>
   </w:style>
-  <w:style w:type="table" w:styleId="62">
+  <w:style w:type="table" w:styleId="753">
     <w:name w:val="Grid Table 7 Colorful - Accent 1"/>
-    <w:basedOn w:val="665"/>
+    <w:basedOn w:val="889"/>
     <w:uiPriority w:val="99"/>
     <w:pPr>
       <w:pBdr/>
@@ -13171,11 +13332,11 @@
         <w:tblBorders/>
       </w:tblPr>
       <w:tcPr>
-        <w:shd w:color="ffffff"/>
+        <w:shd w:val="clear" w:color="ffffff"/>
         <w:tcBorders>
-          <w:top w:val="none"/>
-          <w:left w:val="none"/>
-          <w:bottom w:val="none"/>
+          <w:top w:val="none" w:color="000000" w:sz="4" w:space="0"/>
+          <w:left w:val="none" w:color="000000" w:sz="4" w:space="0"/>
+          <w:bottom w:val="none" w:color="000000" w:sz="4" w:space="0"/>
           <w:right w:val="single" w:color="000000" w:themeColor="accent1" w:themeTint="80" w:sz="4" w:space="0"/>
         </w:tcBorders>
       </w:tcPr>
@@ -13198,10 +13359,10 @@
       <w:tcPr>
         <w:shd w:val="clear" w:color="ffffff" w:themeColor="light1" w:fill="ffffff" w:themeFill="light1"/>
         <w:tcBorders>
-          <w:top w:val="none"/>
-          <w:left w:val="none"/>
+          <w:top w:val="none" w:color="000000" w:sz="4" w:space="0"/>
+          <w:left w:val="none" w:color="000000" w:sz="4" w:space="0"/>
           <w:bottom w:val="single" w:color="000000" w:themeColor="accent1" w:themeTint="80" w:sz="4" w:space="0"/>
-          <w:right w:val="none"/>
+          <w:right w:val="none" w:color="000000" w:sz="4" w:space="0"/>
         </w:tcBorders>
       </w:tcPr>
     </w:tblStylePr>
@@ -13221,12 +13382,12 @@
         <w:tblBorders/>
       </w:tblPr>
       <w:tcPr>
-        <w:shd w:color="ffffff"/>
+        <w:shd w:val="clear" w:color="ffffff"/>
         <w:tcBorders>
-          <w:top w:val="none"/>
+          <w:top w:val="none" w:color="000000" w:sz="4" w:space="0"/>
           <w:left w:val="single" w:color="000000" w:themeColor="accent1" w:themeTint="80" w:sz="4" w:space="0"/>
-          <w:bottom w:val="none"/>
-          <w:right w:val="none"/>
+          <w:bottom w:val="none" w:color="000000" w:sz="4" w:space="0"/>
+          <w:right w:val="none" w:color="000000" w:sz="4" w:space="0"/>
         </w:tcBorders>
       </w:tcPr>
     </w:tblStylePr>
@@ -13249,9 +13410,9 @@
         <w:shd w:val="clear" w:color="ffffff" w:themeColor="light1" w:fill="ffffff" w:themeFill="light1"/>
         <w:tcBorders>
           <w:top w:val="single" w:color="000000" w:themeColor="accent1" w:themeTint="80" w:sz="4" w:space="0"/>
-          <w:left w:val="none"/>
-          <w:bottom w:val="none"/>
-          <w:right w:val="none"/>
+          <w:left w:val="none" w:color="000000" w:sz="4" w:space="0"/>
+          <w:bottom w:val="none" w:color="000000" w:sz="4" w:space="0"/>
+          <w:right w:val="none" w:color="000000" w:sz="4" w:space="0"/>
         </w:tcBorders>
       </w:tcPr>
     </w:tblStylePr>
@@ -13321,9 +13482,9 @@
       </w:tcPr>
     </w:tblStylePr>
   </w:style>
-  <w:style w:type="table" w:styleId="63">
+  <w:style w:type="table" w:styleId="754">
     <w:name w:val="Grid Table 7 Colorful - Accent 2"/>
-    <w:basedOn w:val="665"/>
+    <w:basedOn w:val="889"/>
     <w:uiPriority w:val="99"/>
     <w:pPr>
       <w:pBdr/>
@@ -13425,11 +13586,11 @@
         <w:tblBorders/>
       </w:tblPr>
       <w:tcPr>
-        <w:shd w:color="ffffff"/>
+        <w:shd w:val="clear" w:color="ffffff"/>
         <w:tcBorders>
-          <w:top w:val="none"/>
-          <w:left w:val="none"/>
-          <w:bottom w:val="none"/>
+          <w:top w:val="none" w:color="000000" w:sz="4" w:space="0"/>
+          <w:left w:val="none" w:color="000000" w:sz="4" w:space="0"/>
+          <w:bottom w:val="none" w:color="000000" w:sz="4" w:space="0"/>
           <w:right w:val="single" w:color="000000" w:themeColor="accent2" w:themeTint="97" w:sz="4" w:space="0"/>
         </w:tcBorders>
       </w:tcPr>
@@ -13452,10 +13613,10 @@
       <w:tcPr>
         <w:shd w:val="clear" w:color="ffffff" w:themeColor="light1" w:fill="ffffff" w:themeFill="light1"/>
         <w:tcBorders>
-          <w:top w:val="none"/>
-          <w:left w:val="none"/>
+          <w:top w:val="none" w:color="000000" w:sz="4" w:space="0"/>
+          <w:left w:val="none" w:color="000000" w:sz="4" w:space="0"/>
           <w:bottom w:val="single" w:color="000000" w:themeColor="accent2" w:themeTint="97" w:sz="4" w:space="0"/>
-          <w:right w:val="none"/>
+          <w:right w:val="none" w:color="000000" w:sz="4" w:space="0"/>
         </w:tcBorders>
       </w:tcPr>
     </w:tblStylePr>
@@ -13475,12 +13636,12 @@
         <w:tblBorders/>
       </w:tblPr>
       <w:tcPr>
-        <w:shd w:color="ffffff"/>
+        <w:shd w:val="clear" w:color="ffffff"/>
         <w:tcBorders>
-          <w:top w:val="none"/>
+          <w:top w:val="none" w:color="000000" w:sz="4" w:space="0"/>
           <w:left w:val="single" w:color="000000" w:themeColor="accent2" w:themeTint="97" w:sz="4" w:space="0"/>
-          <w:bottom w:val="none"/>
-          <w:right w:val="none"/>
+          <w:bottom w:val="none" w:color="000000" w:sz="4" w:space="0"/>
+          <w:right w:val="none" w:color="000000" w:sz="4" w:space="0"/>
         </w:tcBorders>
       </w:tcPr>
     </w:tblStylePr>
@@ -13503,9 +13664,9 @@
         <w:shd w:val="clear" w:color="ffffff" w:themeColor="light1" w:fill="ffffff" w:themeFill="light1"/>
         <w:tcBorders>
           <w:top w:val="single" w:color="000000" w:themeColor="accent2" w:themeTint="97" w:sz="4" w:space="0"/>
-          <w:left w:val="none"/>
-          <w:bottom w:val="none"/>
-          <w:right w:val="none"/>
+          <w:left w:val="none" w:color="000000" w:sz="4" w:space="0"/>
+          <w:bottom w:val="none" w:color="000000" w:sz="4" w:space="0"/>
+          <w:right w:val="none" w:color="000000" w:sz="4" w:space="0"/>
         </w:tcBorders>
       </w:tcPr>
     </w:tblStylePr>
@@ -13575,9 +13736,9 @@
       </w:tcPr>
     </w:tblStylePr>
   </w:style>
-  <w:style w:type="table" w:styleId="64">
+  <w:style w:type="table" w:styleId="755">
     <w:name w:val="Grid Table 7 Colorful - Accent 3"/>
-    <w:basedOn w:val="665"/>
+    <w:basedOn w:val="889"/>
     <w:uiPriority w:val="99"/>
     <w:pPr>
       <w:pBdr/>
@@ -13679,11 +13840,11 @@
         <w:tblBorders/>
       </w:tblPr>
       <w:tcPr>
-        <w:shd w:color="ffffff"/>
+        <w:shd w:val="clear" w:color="ffffff"/>
         <w:tcBorders>
-          <w:top w:val="none"/>
-          <w:left w:val="none"/>
-          <w:bottom w:val="none"/>
+          <w:top w:val="none" w:color="000000" w:sz="4" w:space="0"/>
+          <w:left w:val="none" w:color="000000" w:sz="4" w:space="0"/>
+          <w:bottom w:val="none" w:color="000000" w:sz="4" w:space="0"/>
           <w:right w:val="single" w:color="000000" w:themeColor="accent3" w:themeTint="FE" w:sz="4" w:space="0"/>
         </w:tcBorders>
       </w:tcPr>
@@ -13706,10 +13867,10 @@
       <w:tcPr>
         <w:shd w:val="clear" w:color="ffffff" w:themeColor="light1" w:fill="ffffff" w:themeFill="light1"/>
         <w:tcBorders>
-          <w:top w:val="none"/>
-          <w:left w:val="none"/>
+          <w:top w:val="none" w:color="000000" w:sz="4" w:space="0"/>
+          <w:left w:val="none" w:color="000000" w:sz="4" w:space="0"/>
           <w:bottom w:val="single" w:color="000000" w:themeColor="accent3" w:themeTint="FE" w:sz="4" w:space="0"/>
-          <w:right w:val="none"/>
+          <w:right w:val="none" w:color="000000" w:sz="4" w:space="0"/>
         </w:tcBorders>
       </w:tcPr>
     </w:tblStylePr>
@@ -13729,12 +13890,12 @@
         <w:tblBorders/>
       </w:tblPr>
       <w:tcPr>
-        <w:shd w:color="ffffff"/>
+        <w:shd w:val="clear" w:color="ffffff"/>
         <w:tcBorders>
-          <w:top w:val="none"/>
+          <w:top w:val="none" w:color="000000" w:sz="4" w:space="0"/>
           <w:left w:val="single" w:color="000000" w:themeColor="accent3" w:themeTint="FE" w:sz="4" w:space="0"/>
-          <w:bottom w:val="none"/>
-          <w:right w:val="none"/>
+          <w:bottom w:val="none" w:color="000000" w:sz="4" w:space="0"/>
+          <w:right w:val="none" w:color="000000" w:sz="4" w:space="0"/>
         </w:tcBorders>
       </w:tcPr>
     </w:tblStylePr>
@@ -13757,9 +13918,9 @@
         <w:shd w:val="clear" w:color="ffffff" w:themeColor="light1" w:fill="ffffff" w:themeFill="light1"/>
         <w:tcBorders>
           <w:top w:val="single" w:color="000000" w:themeColor="accent3" w:themeTint="FE" w:sz="4" w:space="0"/>
-          <w:left w:val="none"/>
-          <w:bottom w:val="none"/>
-          <w:right w:val="none"/>
+          <w:left w:val="none" w:color="000000" w:sz="4" w:space="0"/>
+          <w:bottom w:val="none" w:color="000000" w:sz="4" w:space="0"/>
+          <w:right w:val="none" w:color="000000" w:sz="4" w:space="0"/>
         </w:tcBorders>
       </w:tcPr>
     </w:tblStylePr>
@@ -13829,9 +13990,9 @@
       </w:tcPr>
     </w:tblStylePr>
   </w:style>
-  <w:style w:type="table" w:styleId="65">
+  <w:style w:type="table" w:styleId="756">
     <w:name w:val="Grid Table 7 Colorful - Accent 4"/>
-    <w:basedOn w:val="665"/>
+    <w:basedOn w:val="889"/>
     <w:uiPriority w:val="99"/>
     <w:pPr>
       <w:pBdr/>
@@ -13933,11 +14094,11 @@
         <w:tblBorders/>
       </w:tblPr>
       <w:tcPr>
-        <w:shd w:color="ffffff"/>
+        <w:shd w:val="clear" w:color="ffffff"/>
         <w:tcBorders>
-          <w:top w:val="none"/>
-          <w:left w:val="none"/>
-          <w:bottom w:val="none"/>
+          <w:top w:val="none" w:color="000000" w:sz="4" w:space="0"/>
+          <w:left w:val="none" w:color="000000" w:sz="4" w:space="0"/>
+          <w:bottom w:val="none" w:color="000000" w:sz="4" w:space="0"/>
           <w:right w:val="single" w:color="000000" w:themeColor="accent4" w:themeTint="9A" w:sz="4" w:space="0"/>
         </w:tcBorders>
       </w:tcPr>
@@ -13960,10 +14121,10 @@
       <w:tcPr>
         <w:shd w:val="clear" w:color="ffffff" w:themeColor="light1" w:fill="ffffff" w:themeFill="light1"/>
         <w:tcBorders>
-          <w:top w:val="none"/>
-          <w:left w:val="none"/>
+          <w:top w:val="none" w:color="000000" w:sz="4" w:space="0"/>
+          <w:left w:val="none" w:color="000000" w:sz="4" w:space="0"/>
           <w:bottom w:val="single" w:color="000000" w:themeColor="accent4" w:themeTint="9A" w:sz="4" w:space="0"/>
-          <w:right w:val="none"/>
+          <w:right w:val="none" w:color="000000" w:sz="4" w:space="0"/>
         </w:tcBorders>
       </w:tcPr>
     </w:tblStylePr>
@@ -13983,12 +14144,12 @@
         <w:tblBorders/>
       </w:tblPr>
       <w:tcPr>
-        <w:shd w:color="ffffff"/>
+        <w:shd w:val="clear" w:color="ffffff"/>
         <w:tcBorders>
-          <w:top w:val="none"/>
+          <w:top w:val="none" w:color="000000" w:sz="4" w:space="0"/>
           <w:left w:val="single" w:color="000000" w:themeColor="accent4" w:themeTint="9A" w:sz="4" w:space="0"/>
-          <w:bottom w:val="none"/>
-          <w:right w:val="none"/>
+          <w:bottom w:val="none" w:color="000000" w:sz="4" w:space="0"/>
+          <w:right w:val="none" w:color="000000" w:sz="4" w:space="0"/>
         </w:tcBorders>
       </w:tcPr>
     </w:tblStylePr>
@@ -14011,9 +14172,9 @@
         <w:shd w:val="clear" w:color="ffffff" w:themeColor="light1" w:fill="ffffff" w:themeFill="light1"/>
         <w:tcBorders>
           <w:top w:val="single" w:color="000000" w:themeColor="accent4" w:themeTint="9A" w:sz="4" w:space="0"/>
-          <w:left w:val="none"/>
-          <w:bottom w:val="none"/>
-          <w:right w:val="none"/>
+          <w:left w:val="none" w:color="000000" w:sz="4" w:space="0"/>
+          <w:bottom w:val="none" w:color="000000" w:sz="4" w:space="0"/>
+          <w:right w:val="none" w:color="000000" w:sz="4" w:space="0"/>
         </w:tcBorders>
       </w:tcPr>
     </w:tblStylePr>
@@ -14083,9 +14244,9 @@
       </w:tcPr>
     </w:tblStylePr>
   </w:style>
-  <w:style w:type="table" w:styleId="66">
+  <w:style w:type="table" w:styleId="757">
     <w:name w:val="Grid Table 7 Colorful - Accent 5"/>
-    <w:basedOn w:val="665"/>
+    <w:basedOn w:val="889"/>
     <w:uiPriority w:val="99"/>
     <w:pPr>
       <w:pBdr/>
@@ -14187,11 +14348,11 @@
         <w:tblBorders/>
       </w:tblPr>
       <w:tcPr>
-        <w:shd w:color="ffffff"/>
+        <w:shd w:val="clear" w:color="ffffff"/>
         <w:tcBorders>
-          <w:top w:val="none"/>
-          <w:left w:val="none"/>
-          <w:bottom w:val="none"/>
+          <w:top w:val="none" w:color="000000" w:sz="4" w:space="0"/>
+          <w:left w:val="none" w:color="000000" w:sz="4" w:space="0"/>
+          <w:bottom w:val="none" w:color="000000" w:sz="4" w:space="0"/>
           <w:right w:val="single" w:color="000000" w:themeColor="accent5" w:themeTint="90" w:sz="4" w:space="0"/>
         </w:tcBorders>
       </w:tcPr>
@@ -14214,10 +14375,10 @@
       <w:tcPr>
         <w:shd w:val="clear" w:color="ffffff" w:themeColor="light1" w:fill="ffffff" w:themeFill="light1"/>
         <w:tcBorders>
-          <w:top w:val="none"/>
-          <w:left w:val="none"/>
+          <w:top w:val="none" w:color="000000" w:sz="4" w:space="0"/>
+          <w:left w:val="none" w:color="000000" w:sz="4" w:space="0"/>
           <w:bottom w:val="single" w:color="000000" w:themeColor="accent5" w:themeTint="90" w:sz="4" w:space="0"/>
-          <w:right w:val="none"/>
+          <w:right w:val="none" w:color="000000" w:sz="4" w:space="0"/>
         </w:tcBorders>
       </w:tcPr>
     </w:tblStylePr>
@@ -14237,12 +14398,12 @@
         <w:tblBorders/>
       </w:tblPr>
       <w:tcPr>
-        <w:shd w:color="ffffff"/>
+        <w:shd w:val="clear" w:color="ffffff"/>
         <w:tcBorders>
-          <w:top w:val="none"/>
+          <w:top w:val="none" w:color="000000" w:sz="4" w:space="0"/>
           <w:left w:val="single" w:color="000000" w:themeColor="accent5" w:themeTint="90" w:sz="4" w:space="0"/>
-          <w:bottom w:val="none"/>
-          <w:right w:val="none"/>
+          <w:bottom w:val="none" w:color="000000" w:sz="4" w:space="0"/>
+          <w:right w:val="none" w:color="000000" w:sz="4" w:space="0"/>
         </w:tcBorders>
       </w:tcPr>
     </w:tblStylePr>
@@ -14265,9 +14426,9 @@
         <w:shd w:val="clear" w:color="ffffff" w:themeColor="light1" w:fill="ffffff" w:themeFill="light1"/>
         <w:tcBorders>
           <w:top w:val="single" w:color="000000" w:themeColor="accent5" w:themeTint="90" w:sz="4" w:space="0"/>
-          <w:left w:val="none"/>
-          <w:bottom w:val="none"/>
-          <w:right w:val="none"/>
+          <w:left w:val="none" w:color="000000" w:sz="4" w:space="0"/>
+          <w:bottom w:val="none" w:color="000000" w:sz="4" w:space="0"/>
+          <w:right w:val="none" w:color="000000" w:sz="4" w:space="0"/>
         </w:tcBorders>
       </w:tcPr>
     </w:tblStylePr>
@@ -14337,9 +14498,9 @@
       </w:tcPr>
     </w:tblStylePr>
   </w:style>
-  <w:style w:type="table" w:styleId="67">
+  <w:style w:type="table" w:styleId="758">
     <w:name w:val="Grid Table 7 Colorful - Accent 6"/>
-    <w:basedOn w:val="665"/>
+    <w:basedOn w:val="889"/>
     <w:uiPriority w:val="99"/>
     <w:pPr>
       <w:pBdr/>
@@ -14441,11 +14602,11 @@
         <w:tblBorders/>
       </w:tblPr>
       <w:tcPr>
-        <w:shd w:color="ffffff"/>
+        <w:shd w:val="clear" w:color="ffffff"/>
         <w:tcBorders>
-          <w:top w:val="none"/>
-          <w:left w:val="none"/>
-          <w:bottom w:val="none"/>
+          <w:top w:val="none" w:color="000000" w:sz="4" w:space="0"/>
+          <w:left w:val="none" w:color="000000" w:sz="4" w:space="0"/>
+          <w:bottom w:val="none" w:color="000000" w:sz="4" w:space="0"/>
           <w:right w:val="single" w:color="000000" w:themeColor="accent6" w:themeTint="90" w:sz="4" w:space="0"/>
         </w:tcBorders>
       </w:tcPr>
@@ -14468,10 +14629,10 @@
       <w:tcPr>
         <w:shd w:val="clear" w:color="ffffff" w:themeColor="light1" w:fill="ffffff" w:themeFill="light1"/>
         <w:tcBorders>
-          <w:top w:val="none"/>
-          <w:left w:val="none"/>
+          <w:top w:val="none" w:color="000000" w:sz="4" w:space="0"/>
+          <w:left w:val="none" w:color="000000" w:sz="4" w:space="0"/>
           <w:bottom w:val="single" w:color="000000" w:themeColor="accent6" w:themeTint="90" w:sz="4" w:space="0"/>
-          <w:right w:val="none"/>
+          <w:right w:val="none" w:color="000000" w:sz="4" w:space="0"/>
         </w:tcBorders>
       </w:tcPr>
     </w:tblStylePr>
@@ -14491,12 +14652,12 @@
         <w:tblBorders/>
       </w:tblPr>
       <w:tcPr>
-        <w:shd w:color="ffffff"/>
+        <w:shd w:val="clear" w:color="ffffff"/>
         <w:tcBorders>
-          <w:top w:val="none"/>
+          <w:top w:val="none" w:color="000000" w:sz="4" w:space="0"/>
           <w:left w:val="single" w:color="000000" w:themeColor="accent6" w:themeTint="90" w:sz="4" w:space="0"/>
-          <w:bottom w:val="none"/>
-          <w:right w:val="none"/>
+          <w:bottom w:val="none" w:color="000000" w:sz="4" w:space="0"/>
+          <w:right w:val="none" w:color="000000" w:sz="4" w:space="0"/>
         </w:tcBorders>
       </w:tcPr>
     </w:tblStylePr>
@@ -14519,9 +14680,9 @@
         <w:shd w:val="clear" w:color="ffffff" w:themeColor="light1" w:fill="ffffff" w:themeFill="light1"/>
         <w:tcBorders>
           <w:top w:val="single" w:color="000000" w:themeColor="accent6" w:themeTint="90" w:sz="4" w:space="0"/>
-          <w:left w:val="none"/>
-          <w:bottom w:val="none"/>
-          <w:right w:val="none"/>
+          <w:left w:val="none" w:color="000000" w:sz="4" w:space="0"/>
+          <w:bottom w:val="none" w:color="000000" w:sz="4" w:space="0"/>
+          <w:right w:val="none" w:color="000000" w:sz="4" w:space="0"/>
         </w:tcBorders>
       </w:tcPr>
     </w:tblStylePr>
@@ -14591,9 +14752,9 @@
       </w:tcPr>
     </w:tblStylePr>
   </w:style>
-  <w:style w:type="table" w:styleId="68">
+  <w:style w:type="table" w:styleId="759">
     <w:name w:val="List Table 1 Light"/>
-    <w:basedOn w:val="665"/>
+    <w:basedOn w:val="889"/>
     <w:uiPriority w:val="99"/>
     <w:pPr>
       <w:pBdr/>
@@ -14807,9 +14968,9 @@
       </w:tcPr>
     </w:tblStylePr>
   </w:style>
-  <w:style w:type="table" w:styleId="69">
+  <w:style w:type="table" w:styleId="760">
     <w:name w:val="List Table 1 Light - Accent 1"/>
-    <w:basedOn w:val="665"/>
+    <w:basedOn w:val="889"/>
     <w:uiPriority w:val="99"/>
     <w:pPr>
       <w:pBdr/>
@@ -15023,9 +15184,9 @@
       </w:tcPr>
     </w:tblStylePr>
   </w:style>
-  <w:style w:type="table" w:styleId="70">
+  <w:style w:type="table" w:styleId="761">
     <w:name w:val="List Table 1 Light - Accent 2"/>
-    <w:basedOn w:val="665"/>
+    <w:basedOn w:val="889"/>
     <w:uiPriority w:val="99"/>
     <w:pPr>
       <w:pBdr/>
@@ -15239,9 +15400,9 @@
       </w:tcPr>
     </w:tblStylePr>
   </w:style>
-  <w:style w:type="table" w:styleId="71">
+  <w:style w:type="table" w:styleId="762">
     <w:name w:val="List Table 1 Light - Accent 3"/>
-    <w:basedOn w:val="665"/>
+    <w:basedOn w:val="889"/>
     <w:uiPriority w:val="99"/>
     <w:pPr>
       <w:pBdr/>
@@ -15455,9 +15616,9 @@
       </w:tcPr>
     </w:tblStylePr>
   </w:style>
-  <w:style w:type="table" w:styleId="72">
+  <w:style w:type="table" w:styleId="763">
     <w:name w:val="List Table 1 Light - Accent 4"/>
-    <w:basedOn w:val="665"/>
+    <w:basedOn w:val="889"/>
     <w:uiPriority w:val="99"/>
     <w:pPr>
       <w:pBdr/>
@@ -15671,9 +15832,9 @@
       </w:tcPr>
     </w:tblStylePr>
   </w:style>
-  <w:style w:type="table" w:styleId="73">
+  <w:style w:type="table" w:styleId="764">
     <w:name w:val="List Table 1 Light - Accent 5"/>
-    <w:basedOn w:val="665"/>
+    <w:basedOn w:val="889"/>
     <w:uiPriority w:val="99"/>
     <w:pPr>
       <w:pBdr/>
@@ -15887,9 +16048,9 @@
       </w:tcPr>
     </w:tblStylePr>
   </w:style>
-  <w:style w:type="table" w:styleId="74">
+  <w:style w:type="table" w:styleId="765">
     <w:name w:val="List Table 1 Light - Accent 6"/>
-    <w:basedOn w:val="665"/>
+    <w:basedOn w:val="889"/>
     <w:uiPriority w:val="99"/>
     <w:pPr>
       <w:pBdr/>
@@ -16103,9 +16264,9 @@
       </w:tcPr>
     </w:tblStylePr>
   </w:style>
-  <w:style w:type="table" w:styleId="75">
+  <w:style w:type="table" w:styleId="766">
     <w:name w:val="List Table 2"/>
-    <w:basedOn w:val="665"/>
+    <w:basedOn w:val="889"/>
     <w:uiPriority w:val="99"/>
     <w:pPr>
       <w:pBdr/>
@@ -16341,9 +16502,9 @@
       </w:tcPr>
     </w:tblStylePr>
   </w:style>
-  <w:style w:type="table" w:styleId="76">
+  <w:style w:type="table" w:styleId="767">
     <w:name w:val="List Table 2 - Accent 1"/>
-    <w:basedOn w:val="665"/>
+    <w:basedOn w:val="889"/>
     <w:uiPriority w:val="99"/>
     <w:pPr>
       <w:pBdr/>
@@ -16579,9 +16740,9 @@
       </w:tcPr>
     </w:tblStylePr>
   </w:style>
-  <w:style w:type="table" w:styleId="77">
+  <w:style w:type="table" w:styleId="768">
     <w:name w:val="List Table 2 - Accent 2"/>
-    <w:basedOn w:val="665"/>
+    <w:basedOn w:val="889"/>
     <w:uiPriority w:val="99"/>
     <w:pPr>
       <w:pBdr/>
@@ -16817,9 +16978,9 @@
       </w:tcPr>
     </w:tblStylePr>
   </w:style>
-  <w:style w:type="table" w:styleId="78">
+  <w:style w:type="table" w:styleId="769">
     <w:name w:val="List Table 2 - Accent 3"/>
-    <w:basedOn w:val="665"/>
+    <w:basedOn w:val="889"/>
     <w:uiPriority w:val="99"/>
     <w:pPr>
       <w:pBdr/>
@@ -17055,9 +17216,9 @@
       </w:tcPr>
     </w:tblStylePr>
   </w:style>
-  <w:style w:type="table" w:styleId="79">
+  <w:style w:type="table" w:styleId="770">
     <w:name w:val="List Table 2 - Accent 4"/>
-    <w:basedOn w:val="665"/>
+    <w:basedOn w:val="889"/>
     <w:uiPriority w:val="99"/>
     <w:pPr>
       <w:pBdr/>
@@ -17293,9 +17454,9 @@
       </w:tcPr>
     </w:tblStylePr>
   </w:style>
-  <w:style w:type="table" w:styleId="80">
+  <w:style w:type="table" w:styleId="771">
     <w:name w:val="List Table 2 - Accent 5"/>
-    <w:basedOn w:val="665"/>
+    <w:basedOn w:val="889"/>
     <w:uiPriority w:val="99"/>
     <w:pPr>
       <w:pBdr/>
@@ -17531,9 +17692,9 @@
       </w:tcPr>
     </w:tblStylePr>
   </w:style>
-  <w:style w:type="table" w:styleId="81">
+  <w:style w:type="table" w:styleId="772">
     <w:name w:val="List Table 2 - Accent 6"/>
-    <w:basedOn w:val="665"/>
+    <w:basedOn w:val="889"/>
     <w:uiPriority w:val="99"/>
     <w:pPr>
       <w:pBdr/>
@@ -17769,9 +17930,9 @@
       </w:tcPr>
     </w:tblStylePr>
   </w:style>
-  <w:style w:type="table" w:styleId="82">
+  <w:style w:type="table" w:styleId="773">
     <w:name w:val="List Table 3"/>
-    <w:basedOn w:val="665"/>
+    <w:basedOn w:val="889"/>
     <w:uiPriority w:val="99"/>
     <w:pPr>
       <w:pBdr/>
@@ -17997,9 +18158,9 @@
       </w:tcPr>
     </w:tblStylePr>
   </w:style>
-  <w:style w:type="table" w:styleId="83">
+  <w:style w:type="table" w:styleId="774">
     <w:name w:val="List Table 3 - Accent 1"/>
-    <w:basedOn w:val="665"/>
+    <w:basedOn w:val="889"/>
     <w:uiPriority w:val="99"/>
     <w:pPr>
       <w:pBdr/>
@@ -18225,9 +18386,9 @@
       </w:tcPr>
     </w:tblStylePr>
   </w:style>
-  <w:style w:type="table" w:styleId="84">
+  <w:style w:type="table" w:styleId="775">
     <w:name w:val="List Table 3 - Accent 2"/>
-    <w:basedOn w:val="665"/>
+    <w:basedOn w:val="889"/>
     <w:uiPriority w:val="99"/>
     <w:pPr>
       <w:pBdr/>
@@ -18453,9 +18614,9 @@
       </w:tcPr>
     </w:tblStylePr>
   </w:style>
-  <w:style w:type="table" w:styleId="85">
+  <w:style w:type="table" w:styleId="776">
     <w:name w:val="List Table 3 - Accent 3"/>
-    <w:basedOn w:val="665"/>
+    <w:basedOn w:val="889"/>
     <w:uiPriority w:val="99"/>
     <w:pPr>
       <w:pBdr/>
@@ -18681,9 +18842,9 @@
       </w:tcPr>
     </w:tblStylePr>
   </w:style>
-  <w:style w:type="table" w:styleId="86">
+  <w:style w:type="table" w:styleId="777">
     <w:name w:val="List Table 3 - Accent 4"/>
-    <w:basedOn w:val="665"/>
+    <w:basedOn w:val="889"/>
     <w:uiPriority w:val="99"/>
     <w:pPr>
       <w:pBdr/>
@@ -18909,9 +19070,9 @@
       </w:tcPr>
     </w:tblStylePr>
   </w:style>
-  <w:style w:type="table" w:styleId="87">
+  <w:style w:type="table" w:styleId="778">
     <w:name w:val="List Table 3 - Accent 5"/>
-    <w:basedOn w:val="665"/>
+    <w:basedOn w:val="889"/>
     <w:uiPriority w:val="99"/>
     <w:pPr>
       <w:pBdr/>
@@ -19137,9 +19298,9 @@
       </w:tcPr>
     </w:tblStylePr>
   </w:style>
-  <w:style w:type="table" w:styleId="88">
+  <w:style w:type="table" w:styleId="779">
     <w:name w:val="List Table 3 - Accent 6"/>
-    <w:basedOn w:val="665"/>
+    <w:basedOn w:val="889"/>
     <w:uiPriority w:val="99"/>
     <w:pPr>
       <w:pBdr/>
@@ -19365,9 +19526,9 @@
       </w:tcPr>
     </w:tblStylePr>
   </w:style>
-  <w:style w:type="table" w:styleId="89">
+  <w:style w:type="table" w:styleId="780">
     <w:name w:val="List Table 4"/>
-    <w:basedOn w:val="665"/>
+    <w:basedOn w:val="889"/>
     <w:uiPriority w:val="99"/>
     <w:pPr>
       <w:pBdr/>
@@ -19590,9 +19751,9 @@
       </w:tcPr>
     </w:tblStylePr>
   </w:style>
-  <w:style w:type="table" w:styleId="90">
+  <w:style w:type="table" w:styleId="781">
     <w:name w:val="List Table 4 - Accent 1"/>
-    <w:basedOn w:val="665"/>
+    <w:basedOn w:val="889"/>
     <w:uiPriority w:val="99"/>
     <w:pPr>
       <w:pBdr/>
@@ -19815,9 +19976,9 @@
       </w:tcPr>
     </w:tblStylePr>
   </w:style>
-  <w:style w:type="table" w:styleId="91">
+  <w:style w:type="table" w:styleId="782">
     <w:name w:val="List Table 4 - Accent 2"/>
-    <w:basedOn w:val="665"/>
+    <w:basedOn w:val="889"/>
     <w:uiPriority w:val="99"/>
     <w:pPr>
       <w:pBdr/>
@@ -20040,9 +20201,9 @@
       </w:tcPr>
     </w:tblStylePr>
   </w:style>
-  <w:style w:type="table" w:styleId="92">
+  <w:style w:type="table" w:styleId="783">
     <w:name w:val="List Table 4 - Accent 3"/>
-    <w:basedOn w:val="665"/>
+    <w:basedOn w:val="889"/>
     <w:uiPriority w:val="99"/>
     <w:pPr>
       <w:pBdr/>
@@ -20265,9 +20426,9 @@
       </w:tcPr>
     </w:tblStylePr>
   </w:style>
-  <w:style w:type="table" w:styleId="93">
+  <w:style w:type="table" w:styleId="784">
     <w:name w:val="List Table 4 - Accent 4"/>
-    <w:basedOn w:val="665"/>
+    <w:basedOn w:val="889"/>
     <w:uiPriority w:val="99"/>
     <w:pPr>
       <w:pBdr/>
@@ -20490,9 +20651,9 @@
       </w:tcPr>
     </w:tblStylePr>
   </w:style>
-  <w:style w:type="table" w:styleId="94">
+  <w:style w:type="table" w:styleId="785">
     <w:name w:val="List Table 4 - Accent 5"/>
-    <w:basedOn w:val="665"/>
+    <w:basedOn w:val="889"/>
     <w:uiPriority w:val="99"/>
     <w:pPr>
       <w:pBdr/>
@@ -20715,9 +20876,9 @@
       </w:tcPr>
     </w:tblStylePr>
   </w:style>
-  <w:style w:type="table" w:styleId="95">
+  <w:style w:type="table" w:styleId="786">
     <w:name w:val="List Table 4 - Accent 6"/>
-    <w:basedOn w:val="665"/>
+    <w:basedOn w:val="889"/>
     <w:uiPriority w:val="99"/>
     <w:pPr>
       <w:pBdr/>
@@ -20940,9 +21101,9 @@
       </w:tcPr>
     </w:tblStylePr>
   </w:style>
-  <w:style w:type="table" w:styleId="96">
+  <w:style w:type="table" w:styleId="787">
     <w:name w:val="List Table 5 Dark"/>
-    <w:basedOn w:val="665"/>
+    <w:basedOn w:val="889"/>
     <w:uiPriority w:val="99"/>
     <w:pPr>
       <w:pBdr/>
@@ -21182,9 +21343,9 @@
       </w:tcPr>
     </w:tblStylePr>
   </w:style>
-  <w:style w:type="table" w:styleId="97">
+  <w:style w:type="table" w:styleId="788">
     <w:name w:val="List Table 5 Dark - Accent 1"/>
-    <w:basedOn w:val="665"/>
+    <w:basedOn w:val="889"/>
     <w:uiPriority w:val="99"/>
     <w:pPr>
       <w:pBdr/>
@@ -21424,9 +21585,9 @@
       </w:tcPr>
     </w:tblStylePr>
   </w:style>
-  <w:style w:type="table" w:styleId="98">
+  <w:style w:type="table" w:styleId="789">
     <w:name w:val="List Table 5 Dark - Accent 2"/>
-    <w:basedOn w:val="665"/>
+    <w:basedOn w:val="889"/>
     <w:uiPriority w:val="99"/>
     <w:pPr>
       <w:pBdr/>
@@ -21666,9 +21827,9 @@
       </w:tcPr>
     </w:tblStylePr>
   </w:style>
-  <w:style w:type="table" w:styleId="99">
+  <w:style w:type="table" w:styleId="790">
     <w:name w:val="List Table 5 Dark - Accent 3"/>
-    <w:basedOn w:val="665"/>
+    <w:basedOn w:val="889"/>
     <w:uiPriority w:val="99"/>
     <w:pPr>
       <w:pBdr/>
@@ -21908,9 +22069,9 @@
       </w:tcPr>
     </w:tblStylePr>
   </w:style>
-  <w:style w:type="table" w:styleId="100">
+  <w:style w:type="table" w:styleId="791">
     <w:name w:val="List Table 5 Dark - Accent 4"/>
-    <w:basedOn w:val="665"/>
+    <w:basedOn w:val="889"/>
     <w:uiPriority w:val="99"/>
     <w:pPr>
       <w:pBdr/>
@@ -22150,9 +22311,9 @@
       </w:tcPr>
     </w:tblStylePr>
   </w:style>
-  <w:style w:type="table" w:styleId="101">
+  <w:style w:type="table" w:styleId="792">
     <w:name w:val="List Table 5 Dark - Accent 5"/>
-    <w:basedOn w:val="665"/>
+    <w:basedOn w:val="889"/>
     <w:uiPriority w:val="99"/>
     <w:pPr>
       <w:pBdr/>
@@ -22392,9 +22553,9 @@
       </w:tcPr>
     </w:tblStylePr>
   </w:style>
-  <w:style w:type="table" w:styleId="102">
+  <w:style w:type="table" w:styleId="793">
     <w:name w:val="List Table 5 Dark - Accent 6"/>
-    <w:basedOn w:val="665"/>
+    <w:basedOn w:val="889"/>
     <w:uiPriority w:val="99"/>
     <w:pPr>
       <w:pBdr/>
@@ -22634,9 +22795,9 @@
       </w:tcPr>
     </w:tblStylePr>
   </w:style>
-  <w:style w:type="table" w:styleId="103">
+  <w:style w:type="table" w:styleId="794">
     <w:name w:val="List Table 6 Colorful"/>
-    <w:basedOn w:val="665"/>
+    <w:basedOn w:val="889"/>
     <w:uiPriority w:val="99"/>
     <w:pPr>
       <w:pBdr/>
@@ -22857,9 +23018,9 @@
       </w:tcPr>
     </w:tblStylePr>
   </w:style>
-  <w:style w:type="table" w:styleId="104">
+  <w:style w:type="table" w:styleId="795">
     <w:name w:val="List Table 6 Colorful - Accent 1"/>
-    <w:basedOn w:val="665"/>
+    <w:basedOn w:val="889"/>
     <w:uiPriority w:val="99"/>
     <w:pPr>
       <w:pBdr/>
@@ -23080,9 +23241,9 @@
       </w:tcPr>
     </w:tblStylePr>
   </w:style>
-  <w:style w:type="table" w:styleId="105">
+  <w:style w:type="table" w:styleId="796">
     <w:name w:val="List Table 6 Colorful - Accent 2"/>
-    <w:basedOn w:val="665"/>
+    <w:basedOn w:val="889"/>
     <w:uiPriority w:val="99"/>
     <w:pPr>
       <w:pBdr/>
@@ -23303,9 +23464,9 @@
       </w:tcPr>
     </w:tblStylePr>
   </w:style>
-  <w:style w:type="table" w:styleId="106">
+  <w:style w:type="table" w:styleId="797">
     <w:name w:val="List Table 6 Colorful - Accent 3"/>
-    <w:basedOn w:val="665"/>
+    <w:basedOn w:val="889"/>
     <w:uiPriority w:val="99"/>
     <w:pPr>
       <w:pBdr/>
@@ -23526,9 +23687,9 @@
       </w:tcPr>
     </w:tblStylePr>
   </w:style>
-  <w:style w:type="table" w:styleId="107">
+  <w:style w:type="table" w:styleId="798">
     <w:name w:val="List Table 6 Colorful - Accent 4"/>
-    <w:basedOn w:val="665"/>
+    <w:basedOn w:val="889"/>
     <w:uiPriority w:val="99"/>
     <w:pPr>
       <w:pBdr/>
@@ -23749,9 +23910,9 @@
       </w:tcPr>
     </w:tblStylePr>
   </w:style>
-  <w:style w:type="table" w:styleId="108">
+  <w:style w:type="table" w:styleId="799">
     <w:name w:val="List Table 6 Colorful - Accent 5"/>
-    <w:basedOn w:val="665"/>
+    <w:basedOn w:val="889"/>
     <w:uiPriority w:val="99"/>
     <w:pPr>
       <w:pBdr/>
@@ -23972,9 +24133,9 @@
       </w:tcPr>
     </w:tblStylePr>
   </w:style>
-  <w:style w:type="table" w:styleId="109">
+  <w:style w:type="table" w:styleId="800">
     <w:name w:val="List Table 6 Colorful - Accent 6"/>
-    <w:basedOn w:val="665"/>
+    <w:basedOn w:val="889"/>
     <w:uiPriority w:val="99"/>
     <w:pPr>
       <w:pBdr/>
@@ -24195,9 +24356,9 @@
       </w:tcPr>
     </w:tblStylePr>
   </w:style>
-  <w:style w:type="table" w:styleId="110">
+  <w:style w:type="table" w:styleId="801">
     <w:name w:val="List Table 7 Colorful"/>
-    <w:basedOn w:val="665"/>
+    <w:basedOn w:val="889"/>
     <w:uiPriority w:val="99"/>
     <w:pPr>
       <w:pBdr/>
@@ -24296,11 +24457,11 @@
         <w:tblBorders/>
       </w:tblPr>
       <w:tcPr>
-        <w:shd w:color="ffffff"/>
+        <w:shd w:val="clear" w:color="ffffff"/>
         <w:tcBorders>
-          <w:top w:val="none"/>
-          <w:left w:val="none"/>
-          <w:bottom w:val="none"/>
+          <w:top w:val="none" w:color="000000" w:sz="4" w:space="0"/>
+          <w:left w:val="none" w:color="000000" w:sz="4" w:space="0"/>
+          <w:bottom w:val="none" w:color="000000" w:sz="4" w:space="0"/>
           <w:right w:val="single" w:color="000000" w:themeColor="text1" w:themeTint="80" w:sz="4" w:space="0"/>
         </w:tcBorders>
       </w:tcPr>
@@ -24323,10 +24484,10 @@
       <w:tcPr>
         <w:shd w:val="clear" w:color="ffffff" w:themeColor="light1" w:fill="ffffff" w:themeFill="light1"/>
         <w:tcBorders>
-          <w:top w:val="none"/>
-          <w:left w:val="none"/>
+          <w:top w:val="none" w:color="000000" w:sz="4" w:space="0"/>
+          <w:left w:val="none" w:color="000000" w:sz="4" w:space="0"/>
           <w:bottom w:val="single" w:color="000000" w:themeColor="text1" w:themeTint="80" w:sz="4" w:space="0"/>
-          <w:right w:val="none"/>
+          <w:right w:val="none" w:color="000000" w:sz="4" w:space="0"/>
         </w:tcBorders>
       </w:tcPr>
     </w:tblStylePr>
@@ -24346,12 +24507,12 @@
         <w:tblBorders/>
       </w:tblPr>
       <w:tcPr>
-        <w:shd w:color="ffffff"/>
+        <w:shd w:val="clear" w:color="ffffff"/>
         <w:tcBorders>
-          <w:top w:val="none"/>
+          <w:top w:val="none" w:color="000000" w:sz="4" w:space="0"/>
           <w:left w:val="single" w:color="000000" w:themeColor="text1" w:themeTint="80" w:sz="4" w:space="0"/>
-          <w:bottom w:val="none"/>
-          <w:right w:val="none"/>
+          <w:bottom w:val="none" w:color="000000" w:sz="4" w:space="0"/>
+          <w:right w:val="none" w:color="000000" w:sz="4" w:space="0"/>
         </w:tcBorders>
       </w:tcPr>
     </w:tblStylePr>
@@ -24374,9 +24535,9 @@
         <w:shd w:val="clear" w:color="ffffff" w:themeColor="light1" w:fill="ffffff" w:themeFill="light1"/>
         <w:tcBorders>
           <w:top w:val="single" w:color="000000" w:themeColor="text1" w:themeTint="80" w:sz="4" w:space="0"/>
-          <w:left w:val="none"/>
-          <w:bottom w:val="none"/>
-          <w:right w:val="none"/>
+          <w:left w:val="none" w:color="000000" w:sz="4" w:space="0"/>
+          <w:bottom w:val="none" w:color="000000" w:sz="4" w:space="0"/>
+          <w:right w:val="none" w:color="000000" w:sz="4" w:space="0"/>
         </w:tcBorders>
       </w:tcPr>
     </w:tblStylePr>
@@ -24451,9 +24612,9 @@
       </w:tcPr>
     </w:tblStylePr>
   </w:style>
-  <w:style w:type="table" w:styleId="111">
+  <w:style w:type="table" w:styleId="802">
     <w:name w:val="List Table 7 Colorful - Accent 1"/>
-    <w:basedOn w:val="665"/>
+    <w:basedOn w:val="889"/>
     <w:uiPriority w:val="99"/>
     <w:pPr>
       <w:pBdr/>
@@ -24552,11 +24713,11 @@
         <w:tblBorders/>
       </w:tblPr>
       <w:tcPr>
-        <w:shd w:color="ffffff"/>
+        <w:shd w:val="clear" w:color="ffffff"/>
         <w:tcBorders>
-          <w:top w:val="none"/>
-          <w:left w:val="none"/>
-          <w:bottom w:val="none"/>
+          <w:top w:val="none" w:color="000000" w:sz="4" w:space="0"/>
+          <w:left w:val="none" w:color="000000" w:sz="4" w:space="0"/>
+          <w:bottom w:val="none" w:color="000000" w:sz="4" w:space="0"/>
           <w:right w:val="single" w:color="000000" w:themeColor="accent1" w:sz="4" w:space="0"/>
         </w:tcBorders>
       </w:tcPr>
@@ -24579,10 +24740,10 @@
       <w:tcPr>
         <w:shd w:val="clear" w:color="ffffff" w:themeColor="light1" w:fill="ffffff" w:themeFill="light1"/>
         <w:tcBorders>
-          <w:top w:val="none"/>
-          <w:left w:val="none"/>
+          <w:top w:val="none" w:color="000000" w:sz="4" w:space="0"/>
+          <w:left w:val="none" w:color="000000" w:sz="4" w:space="0"/>
           <w:bottom w:val="single" w:color="000000" w:themeColor="accent1" w:sz="4" w:space="0"/>
-          <w:right w:val="none"/>
+          <w:right w:val="none" w:color="000000" w:sz="4" w:space="0"/>
         </w:tcBorders>
       </w:tcPr>
     </w:tblStylePr>
@@ -24602,12 +24763,12 @@
         <w:tblBorders/>
       </w:tblPr>
       <w:tcPr>
-        <w:shd w:color="ffffff"/>
+        <w:shd w:val="clear" w:color="ffffff"/>
         <w:tcBorders>
-          <w:top w:val="none"/>
+          <w:top w:val="none" w:color="000000" w:sz="4" w:space="0"/>
           <w:left w:val="single" w:color="000000" w:themeColor="accent1" w:sz="4" w:space="0"/>
-          <w:bottom w:val="none"/>
-          <w:right w:val="none"/>
+          <w:bottom w:val="none" w:color="000000" w:sz="4" w:space="0"/>
+          <w:right w:val="none" w:color="000000" w:sz="4" w:space="0"/>
         </w:tcBorders>
       </w:tcPr>
     </w:tblStylePr>
@@ -24630,9 +24791,9 @@
         <w:shd w:val="clear" w:color="ffffff" w:themeColor="light1" w:fill="ffffff" w:themeFill="light1"/>
         <w:tcBorders>
           <w:top w:val="single" w:color="000000" w:themeColor="accent1" w:sz="4" w:space="0"/>
-          <w:left w:val="none"/>
-          <w:bottom w:val="none"/>
-          <w:right w:val="none"/>
+          <w:left w:val="none" w:color="000000" w:sz="4" w:space="0"/>
+          <w:bottom w:val="none" w:color="000000" w:sz="4" w:space="0"/>
+          <w:right w:val="none" w:color="000000" w:sz="4" w:space="0"/>
         </w:tcBorders>
       </w:tcPr>
     </w:tblStylePr>
@@ -24707,9 +24868,9 @@
       </w:tcPr>
     </w:tblStylePr>
   </w:style>
-  <w:style w:type="table" w:styleId="112">
+  <w:style w:type="table" w:styleId="803">
     <w:name w:val="List Table 7 Colorful - Accent 2"/>
-    <w:basedOn w:val="665"/>
+    <w:basedOn w:val="889"/>
     <w:uiPriority w:val="99"/>
     <w:pPr>
       <w:pBdr/>
@@ -24808,11 +24969,11 @@
         <w:tblBorders/>
       </w:tblPr>
       <w:tcPr>
-        <w:shd w:color="ffffff"/>
+        <w:shd w:val="clear" w:color="ffffff"/>
         <w:tcBorders>
-          <w:top w:val="none"/>
-          <w:left w:val="none"/>
-          <w:bottom w:val="none"/>
+          <w:top w:val="none" w:color="000000" w:sz="4" w:space="0"/>
+          <w:left w:val="none" w:color="000000" w:sz="4" w:space="0"/>
+          <w:bottom w:val="none" w:color="000000" w:sz="4" w:space="0"/>
           <w:right w:val="single" w:color="000000" w:themeColor="accent2" w:themeTint="97" w:sz="4" w:space="0"/>
         </w:tcBorders>
       </w:tcPr>
@@ -24835,10 +24996,10 @@
       <w:tcPr>
         <w:shd w:val="clear" w:color="ffffff" w:themeColor="light1" w:fill="ffffff" w:themeFill="light1"/>
         <w:tcBorders>
-          <w:top w:val="none"/>
-          <w:left w:val="none"/>
+          <w:top w:val="none" w:color="000000" w:sz="4" w:space="0"/>
+          <w:left w:val="none" w:color="000000" w:sz="4" w:space="0"/>
           <w:bottom w:val="single" w:color="000000" w:themeColor="accent2" w:themeTint="97" w:sz="4" w:space="0"/>
-          <w:right w:val="none"/>
+          <w:right w:val="none" w:color="000000" w:sz="4" w:space="0"/>
         </w:tcBorders>
       </w:tcPr>
     </w:tblStylePr>
@@ -24858,12 +25019,12 @@
         <w:tblBorders/>
       </w:tblPr>
       <w:tcPr>
-        <w:shd w:color="ffffff"/>
+        <w:shd w:val="clear" w:color="ffffff"/>
         <w:tcBorders>
-          <w:top w:val="none"/>
+          <w:top w:val="none" w:color="000000" w:sz="4" w:space="0"/>
           <w:left w:val="single" w:color="000000" w:themeColor="accent2" w:themeTint="97" w:sz="4" w:space="0"/>
-          <w:bottom w:val="none"/>
-          <w:right w:val="none"/>
+          <w:bottom w:val="none" w:color="000000" w:sz="4" w:space="0"/>
+          <w:right w:val="none" w:color="000000" w:sz="4" w:space="0"/>
         </w:tcBorders>
       </w:tcPr>
     </w:tblStylePr>
@@ -24886,9 +25047,9 @@
         <w:shd w:val="clear" w:color="ffffff" w:themeColor="light1" w:fill="ffffff" w:themeFill="light1"/>
         <w:tcBorders>
           <w:top w:val="single" w:color="000000" w:themeColor="accent2" w:themeTint="97" w:sz="4" w:space="0"/>
-          <w:left w:val="none"/>
-          <w:bottom w:val="none"/>
-          <w:right w:val="none"/>
+          <w:left w:val="none" w:color="000000" w:sz="4" w:space="0"/>
+          <w:bottom w:val="none" w:color="000000" w:sz="4" w:space="0"/>
+          <w:right w:val="none" w:color="000000" w:sz="4" w:space="0"/>
         </w:tcBorders>
       </w:tcPr>
     </w:tblStylePr>
@@ -24963,9 +25124,9 @@
       </w:tcPr>
     </w:tblStylePr>
   </w:style>
-  <w:style w:type="table" w:styleId="113">
+  <w:style w:type="table" w:styleId="804">
     <w:name w:val="List Table 7 Colorful - Accent 3"/>
-    <w:basedOn w:val="665"/>
+    <w:basedOn w:val="889"/>
     <w:uiPriority w:val="99"/>
     <w:pPr>
       <w:pBdr/>
@@ -25064,11 +25225,11 @@
         <w:tblBorders/>
       </w:tblPr>
       <w:tcPr>
-        <w:shd w:color="ffffff"/>
+        <w:shd w:val="clear" w:color="ffffff"/>
         <w:tcBorders>
-          <w:top w:val="none"/>
-          <w:left w:val="none"/>
-          <w:bottom w:val="none"/>
+          <w:top w:val="none" w:color="000000" w:sz="4" w:space="0"/>
+          <w:left w:val="none" w:color="000000" w:sz="4" w:space="0"/>
+          <w:bottom w:val="none" w:color="000000" w:sz="4" w:space="0"/>
           <w:right w:val="single" w:color="000000" w:themeColor="accent3" w:themeTint="98" w:sz="4" w:space="0"/>
         </w:tcBorders>
       </w:tcPr>
@@ -25091,10 +25252,10 @@
       <w:tcPr>
         <w:shd w:val="clear" w:color="ffffff" w:themeColor="light1" w:fill="ffffff" w:themeFill="light1"/>
         <w:tcBorders>
-          <w:top w:val="none"/>
-          <w:left w:val="none"/>
+          <w:top w:val="none" w:color="000000" w:sz="4" w:space="0"/>
+          <w:left w:val="none" w:color="000000" w:sz="4" w:space="0"/>
           <w:bottom w:val="single" w:color="000000" w:themeColor="accent3" w:themeTint="98" w:sz="4" w:space="0"/>
-          <w:right w:val="none"/>
+          <w:right w:val="none" w:color="000000" w:sz="4" w:space="0"/>
         </w:tcBorders>
       </w:tcPr>
     </w:tblStylePr>
@@ -25114,12 +25275,12 @@
         <w:tblBorders/>
       </w:tblPr>
       <w:tcPr>
-        <w:shd w:color="ffffff"/>
+        <w:shd w:val="clear" w:color="ffffff"/>
         <w:tcBorders>
-          <w:top w:val="none"/>
+          <w:top w:val="none" w:color="000000" w:sz="4" w:space="0"/>
           <w:left w:val="single" w:color="000000" w:themeColor="accent3" w:themeTint="98" w:sz="4" w:space="0"/>
-          <w:bottom w:val="none"/>
-          <w:right w:val="none"/>
+          <w:bottom w:val="none" w:color="000000" w:sz="4" w:space="0"/>
+          <w:right w:val="none" w:color="000000" w:sz="4" w:space="0"/>
         </w:tcBorders>
       </w:tcPr>
     </w:tblStylePr>
@@ -25142,9 +25303,9 @@
         <w:shd w:val="clear" w:color="ffffff" w:themeColor="light1" w:fill="ffffff" w:themeFill="light1"/>
         <w:tcBorders>
           <w:top w:val="single" w:color="000000" w:themeColor="accent3" w:themeTint="98" w:sz="4" w:space="0"/>
-          <w:left w:val="none"/>
-          <w:bottom w:val="none"/>
-          <w:right w:val="none"/>
+          <w:left w:val="none" w:color="000000" w:sz="4" w:space="0"/>
+          <w:bottom w:val="none" w:color="000000" w:sz="4" w:space="0"/>
+          <w:right w:val="none" w:color="000000" w:sz="4" w:space="0"/>
         </w:tcBorders>
       </w:tcPr>
     </w:tblStylePr>
@@ -25219,9 +25380,9 @@
       </w:tcPr>
     </w:tblStylePr>
   </w:style>
-  <w:style w:type="table" w:styleId="114">
+  <w:style w:type="table" w:styleId="805">
     <w:name w:val="List Table 7 Colorful - Accent 4"/>
-    <w:basedOn w:val="665"/>
+    <w:basedOn w:val="889"/>
     <w:uiPriority w:val="99"/>
     <w:pPr>
       <w:pBdr/>
@@ -25320,11 +25481,11 @@
         <w:tblBorders/>
       </w:tblPr>
       <w:tcPr>
-        <w:shd w:color="ffffff"/>
+        <w:shd w:val="clear" w:color="ffffff"/>
         <w:tcBorders>
-          <w:top w:val="none"/>
-          <w:left w:val="none"/>
-          <w:bottom w:val="none"/>
+          <w:top w:val="none" w:color="000000" w:sz="4" w:space="0"/>
+          <w:left w:val="none" w:color="000000" w:sz="4" w:space="0"/>
+          <w:bottom w:val="none" w:color="000000" w:sz="4" w:space="0"/>
           <w:right w:val="single" w:color="000000" w:themeColor="accent4" w:themeTint="9A" w:sz="4" w:space="0"/>
         </w:tcBorders>
       </w:tcPr>
@@ -25347,10 +25508,10 @@
       <w:tcPr>
         <w:shd w:val="clear" w:color="ffffff" w:themeColor="light1" w:fill="ffffff" w:themeFill="light1"/>
         <w:tcBorders>
-          <w:top w:val="none"/>
-          <w:left w:val="none"/>
+          <w:top w:val="none" w:color="000000" w:sz="4" w:space="0"/>
+          <w:left w:val="none" w:color="000000" w:sz="4" w:space="0"/>
           <w:bottom w:val="single" w:color="000000" w:themeColor="accent4" w:themeTint="9A" w:sz="4" w:space="0"/>
-          <w:right w:val="none"/>
+          <w:right w:val="none" w:color="000000" w:sz="4" w:space="0"/>
         </w:tcBorders>
       </w:tcPr>
     </w:tblStylePr>
@@ -25370,12 +25531,12 @@
         <w:tblBorders/>
       </w:tblPr>
       <w:tcPr>
-        <w:shd w:color="ffffff"/>
+        <w:shd w:val="clear" w:color="ffffff"/>
         <w:tcBorders>
-          <w:top w:val="none"/>
+          <w:top w:val="none" w:color="000000" w:sz="4" w:space="0"/>
           <w:left w:val="single" w:color="000000" w:themeColor="accent4" w:themeTint="9A" w:sz="4" w:space="0"/>
-          <w:bottom w:val="none"/>
-          <w:right w:val="none"/>
+          <w:bottom w:val="none" w:color="000000" w:sz="4" w:space="0"/>
+          <w:right w:val="none" w:color="000000" w:sz="4" w:space="0"/>
         </w:tcBorders>
       </w:tcPr>
     </w:tblStylePr>
@@ -25398,9 +25559,9 @@
         <w:shd w:val="clear" w:color="ffffff" w:themeColor="light1" w:fill="ffffff" w:themeFill="light1"/>
         <w:tcBorders>
           <w:top w:val="single" w:color="000000" w:themeColor="accent4" w:themeTint="9A" w:sz="4" w:space="0"/>
-          <w:left w:val="none"/>
-          <w:bottom w:val="none"/>
-          <w:right w:val="none"/>
+          <w:left w:val="none" w:color="000000" w:sz="4" w:space="0"/>
+          <w:bottom w:val="none" w:color="000000" w:sz="4" w:space="0"/>
+          <w:right w:val="none" w:color="000000" w:sz="4" w:space="0"/>
         </w:tcBorders>
       </w:tcPr>
     </w:tblStylePr>
@@ -25475,9 +25636,9 @@
       </w:tcPr>
     </w:tblStylePr>
   </w:style>
-  <w:style w:type="table" w:styleId="115">
+  <w:style w:type="table" w:styleId="806">
     <w:name w:val="List Table 7 Colorful - Accent 5"/>
-    <w:basedOn w:val="665"/>
+    <w:basedOn w:val="889"/>
     <w:uiPriority w:val="99"/>
     <w:pPr>
       <w:pBdr/>
@@ -25576,11 +25737,11 @@
         <w:tblBorders/>
       </w:tblPr>
       <w:tcPr>
-        <w:shd w:color="ffffff"/>
+        <w:shd w:val="clear" w:color="ffffff"/>
         <w:tcBorders>
-          <w:top w:val="none"/>
-          <w:left w:val="none"/>
-          <w:bottom w:val="none"/>
+          <w:top w:val="none" w:color="000000" w:sz="4" w:space="0"/>
+          <w:left w:val="none" w:color="000000" w:sz="4" w:space="0"/>
+          <w:bottom w:val="none" w:color="000000" w:sz="4" w:space="0"/>
           <w:right w:val="single" w:color="000000" w:themeColor="accent5" w:themeTint="9A" w:sz="4" w:space="0"/>
         </w:tcBorders>
       </w:tcPr>
@@ -25603,10 +25764,10 @@
       <w:tcPr>
         <w:shd w:val="clear" w:color="ffffff" w:themeColor="light1" w:fill="ffffff" w:themeFill="light1"/>
         <w:tcBorders>
-          <w:top w:val="none"/>
-          <w:left w:val="none"/>
+          <w:top w:val="none" w:color="000000" w:sz="4" w:space="0"/>
+          <w:left w:val="none" w:color="000000" w:sz="4" w:space="0"/>
           <w:bottom w:val="single" w:color="000000" w:themeColor="accent5" w:themeTint="9A" w:sz="4" w:space="0"/>
-          <w:right w:val="none"/>
+          <w:right w:val="none" w:color="000000" w:sz="4" w:space="0"/>
         </w:tcBorders>
       </w:tcPr>
     </w:tblStylePr>
@@ -25626,12 +25787,12 @@
         <w:tblBorders/>
       </w:tblPr>
       <w:tcPr>
-        <w:shd w:color="ffffff"/>
+        <w:shd w:val="clear" w:color="ffffff"/>
         <w:tcBorders>
-          <w:top w:val="none"/>
+          <w:top w:val="none" w:color="000000" w:sz="4" w:space="0"/>
           <w:left w:val="single" w:color="000000" w:themeColor="accent5" w:themeTint="9A" w:sz="4" w:space="0"/>
-          <w:bottom w:val="none"/>
-          <w:right w:val="none"/>
+          <w:bottom w:val="none" w:color="000000" w:sz="4" w:space="0"/>
+          <w:right w:val="none" w:color="000000" w:sz="4" w:space="0"/>
         </w:tcBorders>
       </w:tcPr>
     </w:tblStylePr>
@@ -25654,9 +25815,9 @@
         <w:shd w:val="clear" w:color="ffffff" w:themeColor="light1" w:fill="ffffff" w:themeFill="light1"/>
         <w:tcBorders>
           <w:top w:val="single" w:color="000000" w:themeColor="accent5" w:themeTint="9A" w:sz="4" w:space="0"/>
-          <w:left w:val="none"/>
-          <w:bottom w:val="none"/>
-          <w:right w:val="none"/>
+          <w:left w:val="none" w:color="000000" w:sz="4" w:space="0"/>
+          <w:bottom w:val="none" w:color="000000" w:sz="4" w:space="0"/>
+          <w:right w:val="none" w:color="000000" w:sz="4" w:space="0"/>
         </w:tcBorders>
       </w:tcPr>
     </w:tblStylePr>
@@ -25731,9 +25892,9 @@
       </w:tcPr>
     </w:tblStylePr>
   </w:style>
-  <w:style w:type="table" w:styleId="116">
+  <w:style w:type="table" w:styleId="807">
     <w:name w:val="List Table 7 Colorful - Accent 6"/>
-    <w:basedOn w:val="665"/>
+    <w:basedOn w:val="889"/>
     <w:uiPriority w:val="99"/>
     <w:pPr>
       <w:pBdr/>
@@ -25832,11 +25993,11 @@
         <w:tblBorders/>
       </w:tblPr>
       <w:tcPr>
-        <w:shd w:color="ffffff"/>
+        <w:shd w:val="clear" w:color="ffffff"/>
         <w:tcBorders>
-          <w:top w:val="none"/>
-          <w:left w:val="none"/>
-          <w:bottom w:val="none"/>
+          <w:top w:val="none" w:color="000000" w:sz="4" w:space="0"/>
+          <w:left w:val="none" w:color="000000" w:sz="4" w:space="0"/>
+          <w:bottom w:val="none" w:color="000000" w:sz="4" w:space="0"/>
           <w:right w:val="single" w:color="000000" w:themeColor="accent6" w:themeTint="98" w:sz="4" w:space="0"/>
         </w:tcBorders>
       </w:tcPr>
@@ -25859,10 +26020,10 @@
       <w:tcPr>
         <w:shd w:val="clear" w:color="ffffff" w:themeColor="light1" w:fill="ffffff" w:themeFill="light1"/>
         <w:tcBorders>
-          <w:top w:val="none"/>
-          <w:left w:val="none"/>
+          <w:top w:val="none" w:color="000000" w:sz="4" w:space="0"/>
+          <w:left w:val="none" w:color="000000" w:sz="4" w:space="0"/>
           <w:bottom w:val="single" w:color="000000" w:themeColor="accent6" w:themeTint="98" w:sz="4" w:space="0"/>
-          <w:right w:val="none"/>
+          <w:right w:val="none" w:color="000000" w:sz="4" w:space="0"/>
         </w:tcBorders>
       </w:tcPr>
     </w:tblStylePr>
@@ -25882,12 +26043,12 @@
         <w:tblBorders/>
       </w:tblPr>
       <w:tcPr>
-        <w:shd w:color="ffffff"/>
+        <w:shd w:val="clear" w:color="ffffff"/>
         <w:tcBorders>
-          <w:top w:val="none"/>
+          <w:top w:val="none" w:color="000000" w:sz="4" w:space="0"/>
           <w:left w:val="single" w:color="000000" w:themeColor="accent6" w:themeTint="98" w:sz="4" w:space="0"/>
-          <w:bottom w:val="none"/>
-          <w:right w:val="none"/>
+          <w:bottom w:val="none" w:color="000000" w:sz="4" w:space="0"/>
+          <w:right w:val="none" w:color="000000" w:sz="4" w:space="0"/>
         </w:tcBorders>
       </w:tcPr>
     </w:tblStylePr>
@@ -25910,9 +26071,9 @@
         <w:shd w:val="clear" w:color="ffffff" w:themeColor="light1" w:fill="ffffff" w:themeFill="light1"/>
         <w:tcBorders>
           <w:top w:val="single" w:color="000000" w:themeColor="accent6" w:themeTint="98" w:sz="4" w:space="0"/>
-          <w:left w:val="none"/>
-          <w:bottom w:val="none"/>
-          <w:right w:val="none"/>
+          <w:left w:val="none" w:color="000000" w:sz="4" w:space="0"/>
+          <w:bottom w:val="none" w:color="000000" w:sz="4" w:space="0"/>
+          <w:right w:val="none" w:color="000000" w:sz="4" w:space="0"/>
         </w:tcBorders>
       </w:tcPr>
     </w:tblStylePr>
@@ -25987,9 +26148,9 @@
       </w:tcPr>
     </w:tblStylePr>
   </w:style>
-  <w:style w:type="table" w:styleId="117">
+  <w:style w:type="table" w:styleId="808">
     <w:name w:val="Lined - Accent"/>
-    <w:basedOn w:val="665"/>
+    <w:basedOn w:val="889"/>
     <w:uiPriority w:val="99"/>
     <w:pPr>
       <w:pBdr/>
@@ -26224,9 +26385,9 @@
       </w:tcPr>
     </w:tblStylePr>
   </w:style>
-  <w:style w:type="table" w:styleId="118">
+  <w:style w:type="table" w:styleId="809">
     <w:name w:val="Lined - Accent 1"/>
-    <w:basedOn w:val="665"/>
+    <w:basedOn w:val="889"/>
     <w:uiPriority w:val="99"/>
     <w:pPr>
       <w:pBdr/>
@@ -26461,9 +26622,9 @@
       </w:tcPr>
     </w:tblStylePr>
   </w:style>
-  <w:style w:type="table" w:styleId="119">
+  <w:style w:type="table" w:styleId="810">
     <w:name w:val="Lined - Accent 2"/>
-    <w:basedOn w:val="665"/>
+    <w:basedOn w:val="889"/>
     <w:uiPriority w:val="99"/>
     <w:pPr>
       <w:pBdr/>
@@ -26698,9 +26859,9 @@
       </w:tcPr>
     </w:tblStylePr>
   </w:style>
-  <w:style w:type="table" w:styleId="120">
+  <w:style w:type="table" w:styleId="811">
     <w:name w:val="Lined - Accent 3"/>
-    <w:basedOn w:val="665"/>
+    <w:basedOn w:val="889"/>
     <w:uiPriority w:val="99"/>
     <w:pPr>
       <w:pBdr/>
@@ -26935,9 +27096,9 @@
       </w:tcPr>
     </w:tblStylePr>
   </w:style>
-  <w:style w:type="table" w:styleId="121">
+  <w:style w:type="table" w:styleId="812">
     <w:name w:val="Lined - Accent 4"/>
-    <w:basedOn w:val="665"/>
+    <w:basedOn w:val="889"/>
     <w:uiPriority w:val="99"/>
     <w:pPr>
       <w:pBdr/>
@@ -27172,9 +27333,9 @@
       </w:tcPr>
     </w:tblStylePr>
   </w:style>
-  <w:style w:type="table" w:styleId="122">
+  <w:style w:type="table" w:styleId="813">
     <w:name w:val="Lined - Accent 5"/>
-    <w:basedOn w:val="665"/>
+    <w:basedOn w:val="889"/>
     <w:uiPriority w:val="99"/>
     <w:pPr>
       <w:pBdr/>
@@ -27409,9 +27570,9 @@
       </w:tcPr>
     </w:tblStylePr>
   </w:style>
-  <w:style w:type="table" w:styleId="123">
+  <w:style w:type="table" w:styleId="814">
     <w:name w:val="Lined - Accent 6"/>
-    <w:basedOn w:val="665"/>
+    <w:basedOn w:val="889"/>
     <w:uiPriority w:val="99"/>
     <w:pPr>
       <w:pBdr/>
@@ -27646,9 +27807,9 @@
       </w:tcPr>
     </w:tblStylePr>
   </w:style>
-  <w:style w:type="table" w:styleId="124">
+  <w:style w:type="table" w:styleId="815">
     <w:name w:val="Bordered &amp; Lined - Accent"/>
-    <w:basedOn w:val="665"/>
+    <w:basedOn w:val="889"/>
     <w:uiPriority w:val="99"/>
     <w:pPr>
       <w:pBdr/>
@@ -27890,9 +28051,9 @@
       </w:tcPr>
     </w:tblStylePr>
   </w:style>
-  <w:style w:type="table" w:styleId="125">
+  <w:style w:type="table" w:styleId="816">
     <w:name w:val="Bordered &amp; Lined - Accent 1"/>
-    <w:basedOn w:val="665"/>
+    <w:basedOn w:val="889"/>
     <w:uiPriority w:val="99"/>
     <w:pPr>
       <w:pBdr/>
@@ -28134,9 +28295,9 @@
       </w:tcPr>
     </w:tblStylePr>
   </w:style>
-  <w:style w:type="table" w:styleId="126">
+  <w:style w:type="table" w:styleId="817">
     <w:name w:val="Bordered &amp; Lined - Accent 2"/>
-    <w:basedOn w:val="665"/>
+    <w:basedOn w:val="889"/>
     <w:uiPriority w:val="99"/>
     <w:pPr>
       <w:pBdr/>
@@ -28378,9 +28539,9 @@
       </w:tcPr>
     </w:tblStylePr>
   </w:style>
-  <w:style w:type="table" w:styleId="127">
+  <w:style w:type="table" w:styleId="818">
     <w:name w:val="Bordered &amp; Lined - Accent 3"/>
-    <w:basedOn w:val="665"/>
+    <w:basedOn w:val="889"/>
     <w:uiPriority w:val="99"/>
     <w:pPr>
       <w:pBdr/>
@@ -28622,9 +28783,9 @@
       </w:tcPr>
     </w:tblStylePr>
   </w:style>
-  <w:style w:type="table" w:styleId="128">
+  <w:style w:type="table" w:styleId="819">
     <w:name w:val="Bordered &amp; Lined - Accent 4"/>
-    <w:basedOn w:val="665"/>
+    <w:basedOn w:val="889"/>
     <w:uiPriority w:val="99"/>
     <w:pPr>
       <w:pBdr/>
@@ -28866,9 +29027,9 @@
       </w:tcPr>
     </w:tblStylePr>
   </w:style>
-  <w:style w:type="table" w:styleId="129">
+  <w:style w:type="table" w:styleId="820">
     <w:name w:val="Bordered &amp; Lined - Accent 5"/>
-    <w:basedOn w:val="665"/>
+    <w:basedOn w:val="889"/>
     <w:uiPriority w:val="99"/>
     <w:pPr>
       <w:pBdr/>
@@ -29110,9 +29271,9 @@
       </w:tcPr>
     </w:tblStylePr>
   </w:style>
-  <w:style w:type="table" w:styleId="130">
+  <w:style w:type="table" w:styleId="821">
     <w:name w:val="Bordered &amp; Lined - Accent 6"/>
-    <w:basedOn w:val="665"/>
+    <w:basedOn w:val="889"/>
     <w:uiPriority w:val="99"/>
     <w:pPr>
       <w:pBdr/>
@@ -29354,9 +29515,9 @@
       </w:tcPr>
     </w:tblStylePr>
   </w:style>
-  <w:style w:type="table" w:styleId="131">
+  <w:style w:type="table" w:styleId="822">
     <w:name w:val="Bordered"/>
-    <w:basedOn w:val="665"/>
+    <w:basedOn w:val="889"/>
     <w:uiPriority w:val="99"/>
     <w:pPr>
       <w:pBdr/>
@@ -29585,9 +29746,9 @@
       </w:tcPr>
     </w:tblStylePr>
   </w:style>
-  <w:style w:type="table" w:styleId="132">
+  <w:style w:type="table" w:styleId="823">
     <w:name w:val="Bordered - Accent 1"/>
-    <w:basedOn w:val="665"/>
+    <w:basedOn w:val="889"/>
     <w:uiPriority w:val="99"/>
     <w:pPr>
       <w:pBdr/>
@@ -29816,9 +29977,9 @@
       </w:tcPr>
     </w:tblStylePr>
   </w:style>
-  <w:style w:type="table" w:styleId="133">
+  <w:style w:type="table" w:styleId="824">
     <w:name w:val="Bordered - Accent 2"/>
-    <w:basedOn w:val="665"/>
+    <w:basedOn w:val="889"/>
     <w:uiPriority w:val="99"/>
     <w:pPr>
       <w:pBdr/>
@@ -30047,9 +30208,9 @@
       </w:tcPr>
     </w:tblStylePr>
   </w:style>
-  <w:style w:type="table" w:styleId="134">
+  <w:style w:type="table" w:styleId="825">
     <w:name w:val="Bordered - Accent 3"/>
-    <w:basedOn w:val="665"/>
+    <w:basedOn w:val="889"/>
     <w:uiPriority w:val="99"/>
     <w:pPr>
       <w:pBdr/>
@@ -30278,9 +30439,9 @@
       </w:tcPr>
     </w:tblStylePr>
   </w:style>
-  <w:style w:type="table" w:styleId="135">
+  <w:style w:type="table" w:styleId="826">
     <w:name w:val="Bordered - Accent 4"/>
-    <w:basedOn w:val="665"/>
+    <w:basedOn w:val="889"/>
     <w:uiPriority w:val="99"/>
     <w:pPr>
       <w:pBdr/>
@@ -30509,9 +30670,9 @@
       </w:tcPr>
     </w:tblStylePr>
   </w:style>
-  <w:style w:type="table" w:styleId="136">
+  <w:style w:type="table" w:styleId="827">
     <w:name w:val="Bordered - Accent 5"/>
-    <w:basedOn w:val="665"/>
+    <w:basedOn w:val="889"/>
     <w:uiPriority w:val="99"/>
     <w:pPr>
       <w:pBdr/>
@@ -30740,9 +30901,9 @@
       </w:tcPr>
     </w:tblStylePr>
   </w:style>
-  <w:style w:type="table" w:styleId="137">
+  <w:style w:type="table" w:styleId="828">
     <w:name w:val="Bordered - Accent 6"/>
-    <w:basedOn w:val="665"/>
+    <w:basedOn w:val="889"/>
     <w:uiPriority w:val="99"/>
     <w:pPr>
       <w:pBdr/>
@@ -30971,11 +31132,11 @@
       </w:tcPr>
     </w:tblStylePr>
   </w:style>
-  <w:style w:type="paragraph" w:styleId="139">
+  <w:style w:type="paragraph" w:styleId="829">
     <w:name w:val="Heading 1"/>
-    <w:basedOn w:val="664"/>
-    <w:next w:val="664"/>
-    <w:link w:val="150"/>
+    <w:basedOn w:val="888"/>
+    <w:next w:val="888"/>
+    <w:link w:val="839"/>
     <w:uiPriority w:val="9"/>
     <w:qFormat/>
     <w:pPr>
@@ -30993,11 +31154,11 @@
       <w:szCs w:val="40"/>
     </w:rPr>
   </w:style>
-  <w:style w:type="paragraph" w:styleId="140">
+  <w:style w:type="paragraph" w:styleId="830">
     <w:name w:val="Heading 2"/>
-    <w:basedOn w:val="664"/>
-    <w:next w:val="664"/>
-    <w:link w:val="151"/>
+    <w:basedOn w:val="888"/>
+    <w:next w:val="888"/>
+    <w:link w:val="840"/>
     <w:uiPriority w:val="9"/>
     <w:unhideWhenUsed/>
     <w:qFormat/>
@@ -31016,11 +31177,11 @@
       <w:szCs w:val="32"/>
     </w:rPr>
   </w:style>
-  <w:style w:type="paragraph" w:styleId="141">
+  <w:style w:type="paragraph" w:styleId="831">
     <w:name w:val="Heading 3"/>
-    <w:basedOn w:val="664"/>
-    <w:next w:val="664"/>
-    <w:link w:val="152"/>
+    <w:basedOn w:val="888"/>
+    <w:next w:val="888"/>
+    <w:link w:val="841"/>
     <w:uiPriority w:val="9"/>
     <w:unhideWhenUsed/>
     <w:qFormat/>
@@ -31039,11 +31200,11 @@
       <w:szCs w:val="28"/>
     </w:rPr>
   </w:style>
-  <w:style w:type="paragraph" w:styleId="142">
+  <w:style w:type="paragraph" w:styleId="832">
     <w:name w:val="Heading 4"/>
-    <w:basedOn w:val="664"/>
-    <w:next w:val="664"/>
-    <w:link w:val="153"/>
+    <w:basedOn w:val="888"/>
+    <w:next w:val="888"/>
+    <w:link w:val="842"/>
     <w:uiPriority w:val="9"/>
     <w:unhideWhenUsed/>
     <w:qFormat/>
@@ -31062,11 +31223,11 @@
       <w:color w:val="0f4761" w:themeColor="accent1" w:themeShade="BF"/>
     </w:rPr>
   </w:style>
-  <w:style w:type="paragraph" w:styleId="143">
+  <w:style w:type="paragraph" w:styleId="833">
     <w:name w:val="Heading 5"/>
-    <w:basedOn w:val="664"/>
-    <w:next w:val="664"/>
-    <w:link w:val="154"/>
+    <w:basedOn w:val="888"/>
+    <w:next w:val="888"/>
+    <w:link w:val="843"/>
     <w:uiPriority w:val="9"/>
     <w:unhideWhenUsed/>
     <w:qFormat/>
@@ -31083,11 +31244,11 @@
       <w:color w:val="0f4761" w:themeColor="accent1" w:themeShade="BF"/>
     </w:rPr>
   </w:style>
-  <w:style w:type="paragraph" w:styleId="144">
+  <w:style w:type="paragraph" w:styleId="834">
     <w:name w:val="Heading 6"/>
-    <w:basedOn w:val="664"/>
-    <w:next w:val="664"/>
-    <w:link w:val="155"/>
+    <w:basedOn w:val="888"/>
+    <w:next w:val="888"/>
+    <w:link w:val="844"/>
     <w:uiPriority w:val="9"/>
     <w:unhideWhenUsed/>
     <w:qFormat/>
@@ -31106,11 +31267,11 @@
       <w:color w:val="595959" w:themeColor="text1" w:themeTint="A6"/>
     </w:rPr>
   </w:style>
-  <w:style w:type="paragraph" w:styleId="145">
+  <w:style w:type="paragraph" w:styleId="835">
     <w:name w:val="Heading 7"/>
-    <w:basedOn w:val="664"/>
-    <w:next w:val="664"/>
-    <w:link w:val="156"/>
+    <w:basedOn w:val="888"/>
+    <w:next w:val="888"/>
+    <w:link w:val="845"/>
     <w:uiPriority w:val="9"/>
     <w:unhideWhenUsed/>
     <w:qFormat/>
@@ -31127,11 +31288,11 @@
       <w:color w:val="595959" w:themeColor="text1" w:themeTint="A6"/>
     </w:rPr>
   </w:style>
-  <w:style w:type="paragraph" w:styleId="146">
+  <w:style w:type="paragraph" w:styleId="836">
     <w:name w:val="Heading 8"/>
-    <w:basedOn w:val="664"/>
-    <w:next w:val="664"/>
-    <w:link w:val="157"/>
+    <w:basedOn w:val="888"/>
+    <w:next w:val="888"/>
+    <w:link w:val="846"/>
     <w:uiPriority w:val="9"/>
     <w:unhideWhenUsed/>
     <w:qFormat/>
@@ -31150,11 +31311,11 @@
       <w:color w:val="272727" w:themeColor="text1" w:themeTint="D8"/>
     </w:rPr>
   </w:style>
-  <w:style w:type="paragraph" w:styleId="147">
+  <w:style w:type="paragraph" w:styleId="837">
     <w:name w:val="Heading 9"/>
-    <w:basedOn w:val="664"/>
-    <w:next w:val="664"/>
-    <w:link w:val="158"/>
+    <w:basedOn w:val="888"/>
+    <w:next w:val="888"/>
+    <w:link w:val="847"/>
     <w:uiPriority w:val="9"/>
     <w:unhideWhenUsed/>
     <w:qFormat/>
@@ -31173,7 +31334,7 @@
       <w:color w:val="272727" w:themeColor="text1" w:themeTint="D8"/>
     </w:rPr>
   </w:style>
-  <w:style w:type="character" w:styleId="148" w:default="1">
+  <w:style w:type="character" w:styleId="838" w:default="1">
     <w:name w:val="Default Paragraph Font"/>
     <w:uiPriority w:val="1"/>
     <w:semiHidden/>
@@ -31184,10 +31345,10 @@
       <w:ind/>
     </w:pPr>
   </w:style>
-  <w:style w:type="character" w:styleId="150">
+  <w:style w:type="character" w:styleId="839">
     <w:name w:val="Heading 1 Char"/>
-    <w:basedOn w:val="148"/>
-    <w:link w:val="139"/>
+    <w:basedOn w:val="838"/>
+    <w:link w:val="829"/>
     <w:uiPriority w:val="9"/>
     <w:pPr>
       <w:pBdr/>
@@ -31201,10 +31362,10 @@
       <w:szCs w:val="40"/>
     </w:rPr>
   </w:style>
-  <w:style w:type="character" w:styleId="151">
+  <w:style w:type="character" w:styleId="840">
     <w:name w:val="Heading 2 Char"/>
-    <w:basedOn w:val="148"/>
-    <w:link w:val="140"/>
+    <w:basedOn w:val="838"/>
+    <w:link w:val="830"/>
     <w:uiPriority w:val="9"/>
     <w:pPr>
       <w:pBdr/>
@@ -31218,10 +31379,10 @@
       <w:szCs w:val="32"/>
     </w:rPr>
   </w:style>
-  <w:style w:type="character" w:styleId="152">
+  <w:style w:type="character" w:styleId="841">
     <w:name w:val="Heading 3 Char"/>
-    <w:basedOn w:val="148"/>
-    <w:link w:val="141"/>
+    <w:basedOn w:val="838"/>
+    <w:link w:val="831"/>
     <w:uiPriority w:val="9"/>
     <w:pPr>
       <w:pBdr/>
@@ -31235,10 +31396,10 @@
       <w:szCs w:val="28"/>
     </w:rPr>
   </w:style>
-  <w:style w:type="character" w:styleId="153">
+  <w:style w:type="character" w:styleId="842">
     <w:name w:val="Heading 4 Char"/>
-    <w:basedOn w:val="148"/>
-    <w:link w:val="142"/>
+    <w:basedOn w:val="838"/>
+    <w:link w:val="832"/>
     <w:uiPriority w:val="9"/>
     <w:pPr>
       <w:pBdr/>
@@ -31252,10 +31413,10 @@
       <w:color w:val="0f4761" w:themeColor="accent1" w:themeShade="BF"/>
     </w:rPr>
   </w:style>
-  <w:style w:type="character" w:styleId="154">
+  <w:style w:type="character" w:styleId="843">
     <w:name w:val="Heading 5 Char"/>
-    <w:basedOn w:val="148"/>
-    <w:link w:val="143"/>
+    <w:basedOn w:val="838"/>
+    <w:link w:val="833"/>
     <w:uiPriority w:val="9"/>
     <w:pPr>
       <w:pBdr/>
@@ -31267,10 +31428,10 @@
       <w:color w:val="0f4761" w:themeColor="accent1" w:themeShade="BF"/>
     </w:rPr>
   </w:style>
-  <w:style w:type="character" w:styleId="155">
+  <w:style w:type="character" w:styleId="844">
     <w:name w:val="Heading 6 Char"/>
-    <w:basedOn w:val="148"/>
-    <w:link w:val="144"/>
+    <w:basedOn w:val="838"/>
+    <w:link w:val="834"/>
     <w:uiPriority w:val="9"/>
     <w:pPr>
       <w:pBdr/>
@@ -31284,10 +31445,10 @@
       <w:color w:val="595959" w:themeColor="text1" w:themeTint="A6"/>
     </w:rPr>
   </w:style>
-  <w:style w:type="character" w:styleId="156">
+  <w:style w:type="character" w:styleId="845">
     <w:name w:val="Heading 7 Char"/>
-    <w:basedOn w:val="148"/>
-    <w:link w:val="145"/>
+    <w:basedOn w:val="838"/>
+    <w:link w:val="835"/>
     <w:uiPriority w:val="9"/>
     <w:pPr>
       <w:pBdr/>
@@ -31299,10 +31460,10 @@
       <w:color w:val="595959" w:themeColor="text1" w:themeTint="A6"/>
     </w:rPr>
   </w:style>
-  <w:style w:type="character" w:styleId="157">
+  <w:style w:type="character" w:styleId="846">
     <w:name w:val="Heading 8 Char"/>
-    <w:basedOn w:val="148"/>
-    <w:link w:val="146"/>
+    <w:basedOn w:val="838"/>
+    <w:link w:val="836"/>
     <w:uiPriority w:val="9"/>
     <w:pPr>
       <w:pBdr/>
@@ -31316,10 +31477,10 @@
       <w:color w:val="272727" w:themeColor="text1" w:themeTint="D8"/>
     </w:rPr>
   </w:style>
-  <w:style w:type="character" w:styleId="158">
+  <w:style w:type="character" w:styleId="847">
     <w:name w:val="Heading 9 Char"/>
-    <w:basedOn w:val="148"/>
-    <w:link w:val="147"/>
+    <w:basedOn w:val="838"/>
+    <w:link w:val="837"/>
     <w:uiPriority w:val="9"/>
     <w:pPr>
       <w:pBdr/>
@@ -31333,11 +31494,11 @@
       <w:color w:val="272727" w:themeColor="text1" w:themeTint="D8"/>
     </w:rPr>
   </w:style>
-  <w:style w:type="paragraph" w:styleId="159">
+  <w:style w:type="paragraph" w:styleId="848">
     <w:name w:val="Title"/>
-    <w:basedOn w:val="664"/>
-    <w:next w:val="664"/>
-    <w:link w:val="160"/>
+    <w:basedOn w:val="888"/>
+    <w:next w:val="888"/>
+    <w:link w:val="849"/>
     <w:uiPriority w:val="10"/>
     <w:qFormat/>
     <w:pPr>
@@ -31353,10 +31514,10 @@
       <w:szCs w:val="56"/>
     </w:rPr>
   </w:style>
-  <w:style w:type="character" w:styleId="160">
+  <w:style w:type="character" w:styleId="849">
     <w:name w:val="Title Char"/>
-    <w:basedOn w:val="148"/>
-    <w:link w:val="159"/>
+    <w:basedOn w:val="838"/>
+    <w:link w:val="848"/>
     <w:uiPriority w:val="10"/>
     <w:pPr>
       <w:pBdr/>
@@ -31370,11 +31531,11 @@
       <w:szCs w:val="56"/>
     </w:rPr>
   </w:style>
-  <w:style w:type="paragraph" w:styleId="161">
+  <w:style w:type="paragraph" w:styleId="850">
     <w:name w:val="Subtitle"/>
-    <w:basedOn w:val="664"/>
-    <w:next w:val="664"/>
-    <w:link w:val="162"/>
+    <w:basedOn w:val="888"/>
+    <w:next w:val="888"/>
+    <w:link w:val="851"/>
     <w:uiPriority w:val="11"/>
     <w:qFormat/>
     <w:pPr>
@@ -31392,10 +31553,10 @@
       <w:szCs w:val="28"/>
     </w:rPr>
   </w:style>
-  <w:style w:type="character" w:styleId="162">
+  <w:style w:type="character" w:styleId="851">
     <w:name w:val="Subtitle Char"/>
-    <w:basedOn w:val="148"/>
-    <w:link w:val="161"/>
+    <w:basedOn w:val="838"/>
+    <w:link w:val="850"/>
     <w:uiPriority w:val="11"/>
     <w:pPr>
       <w:pBdr/>
@@ -31409,11 +31570,11 @@
       <w:szCs w:val="28"/>
     </w:rPr>
   </w:style>
-  <w:style w:type="paragraph" w:styleId="163">
+  <w:style w:type="paragraph" w:styleId="852">
     <w:name w:val="Quote"/>
-    <w:basedOn w:val="664"/>
-    <w:next w:val="664"/>
-    <w:link w:val="164"/>
+    <w:basedOn w:val="888"/>
+    <w:next w:val="888"/>
+    <w:link w:val="853"/>
     <w:uiPriority w:val="29"/>
     <w:qFormat/>
     <w:pPr>
@@ -31428,10 +31589,10 @@
       <w:color w:val="404040" w:themeColor="text1" w:themeTint="BF"/>
     </w:rPr>
   </w:style>
-  <w:style w:type="character" w:styleId="164">
+  <w:style w:type="character" w:styleId="853">
     <w:name w:val="Quote Char"/>
-    <w:basedOn w:val="148"/>
-    <w:link w:val="163"/>
+    <w:basedOn w:val="838"/>
+    <w:link w:val="852"/>
     <w:uiPriority w:val="29"/>
     <w:pPr>
       <w:pBdr/>
@@ -31444,9 +31605,9 @@
       <w:color w:val="404040" w:themeColor="text1" w:themeTint="BF"/>
     </w:rPr>
   </w:style>
-  <w:style w:type="character" w:styleId="166">
+  <w:style w:type="character" w:styleId="854">
     <w:name w:val="Intense Emphasis"/>
-    <w:basedOn w:val="148"/>
+    <w:basedOn w:val="838"/>
     <w:uiPriority w:val="21"/>
     <w:qFormat/>
     <w:pPr>
@@ -31460,11 +31621,11 @@
       <w:color w:val="0f4761" w:themeColor="accent1" w:themeShade="BF"/>
     </w:rPr>
   </w:style>
-  <w:style w:type="paragraph" w:styleId="167">
+  <w:style w:type="paragraph" w:styleId="855">
     <w:name w:val="Intense Quote"/>
-    <w:basedOn w:val="664"/>
-    <w:next w:val="664"/>
-    <w:link w:val="168"/>
+    <w:basedOn w:val="888"/>
+    <w:next w:val="888"/>
+    <w:link w:val="856"/>
     <w:uiPriority w:val="30"/>
     <w:qFormat/>
     <w:pPr>
@@ -31482,10 +31643,10 @@
       <w:color w:val="0f4761" w:themeColor="accent1" w:themeShade="BF"/>
     </w:rPr>
   </w:style>
-  <w:style w:type="character" w:styleId="168">
+  <w:style w:type="character" w:styleId="856">
     <w:name w:val="Intense Quote Char"/>
-    <w:basedOn w:val="148"/>
-    <w:link w:val="167"/>
+    <w:basedOn w:val="838"/>
+    <w:link w:val="855"/>
     <w:uiPriority w:val="30"/>
     <w:pPr>
       <w:pBdr/>
@@ -31498,9 +31659,9 @@
       <w:color w:val="0f4761" w:themeColor="accent1" w:themeShade="BF"/>
     </w:rPr>
   </w:style>
-  <w:style w:type="character" w:styleId="169">
+  <w:style w:type="character" w:styleId="857">
     <w:name w:val="Intense Reference"/>
-    <w:basedOn w:val="148"/>
+    <w:basedOn w:val="838"/>
     <w:uiPriority w:val="32"/>
     <w:qFormat/>
     <w:pPr>
@@ -31516,9 +31677,9 @@
       <w:spacing w:val="5"/>
     </w:rPr>
   </w:style>
-  <w:style w:type="character" w:styleId="171">
+  <w:style w:type="character" w:styleId="858">
     <w:name w:val="Subtle Emphasis"/>
-    <w:basedOn w:val="148"/>
+    <w:basedOn w:val="838"/>
     <w:uiPriority w:val="19"/>
     <w:qFormat/>
     <w:pPr>
@@ -31532,9 +31693,9 @@
       <w:color w:val="404040" w:themeColor="text1" w:themeTint="BF"/>
     </w:rPr>
   </w:style>
-  <w:style w:type="character" w:styleId="172">
+  <w:style w:type="character" w:styleId="859">
     <w:name w:val="Emphasis"/>
-    <w:basedOn w:val="148"/>
+    <w:basedOn w:val="838"/>
     <w:uiPriority w:val="20"/>
     <w:qFormat/>
     <w:pPr>
@@ -31547,9 +31708,9 @@
       <w:iCs/>
     </w:rPr>
   </w:style>
-  <w:style w:type="character" w:styleId="173">
+  <w:style w:type="character" w:styleId="860">
     <w:name w:val="Strong"/>
-    <w:basedOn w:val="148"/>
+    <w:basedOn w:val="838"/>
     <w:uiPriority w:val="22"/>
     <w:qFormat/>
     <w:pPr>
@@ -31562,9 +31723,9 @@
       <w:bCs/>
     </w:rPr>
   </w:style>
-  <w:style w:type="character" w:styleId="174">
+  <w:style w:type="character" w:styleId="861">
     <w:name w:val="Subtle Reference"/>
-    <w:basedOn w:val="148"/>
+    <w:basedOn w:val="838"/>
     <w:uiPriority w:val="31"/>
     <w:qFormat/>
     <w:pPr>
@@ -31577,9 +31738,9 @@
       <w:color w:val="5a5a5a" w:themeColor="text1" w:themeTint="A5"/>
     </w:rPr>
   </w:style>
-  <w:style w:type="character" w:styleId="175">
+  <w:style w:type="character" w:styleId="862">
     <w:name w:val="Book Title"/>
-    <w:basedOn w:val="148"/>
+    <w:basedOn w:val="838"/>
     <w:uiPriority w:val="33"/>
     <w:qFormat/>
     <w:pPr>
@@ -31595,10 +31756,10 @@
       <w:spacing w:val="5"/>
     </w:rPr>
   </w:style>
-  <w:style w:type="paragraph" w:styleId="176">
+  <w:style w:type="paragraph" w:styleId="863">
     <w:name w:val="Header"/>
-    <w:basedOn w:val="664"/>
-    <w:link w:val="177"/>
+    <w:basedOn w:val="888"/>
+    <w:link w:val="864"/>
     <w:uiPriority w:val="99"/>
     <w:unhideWhenUsed/>
     <w:pPr>
@@ -31611,10 +31772,10 @@
       <w:ind/>
     </w:pPr>
   </w:style>
-  <w:style w:type="character" w:styleId="177">
+  <w:style w:type="character" w:styleId="864">
     <w:name w:val="Header Char"/>
-    <w:basedOn w:val="148"/>
-    <w:link w:val="176"/>
+    <w:basedOn w:val="838"/>
+    <w:link w:val="863"/>
     <w:uiPriority w:val="99"/>
     <w:pPr>
       <w:pBdr/>
@@ -31622,10 +31783,10 @@
       <w:ind/>
     </w:pPr>
   </w:style>
-  <w:style w:type="paragraph" w:styleId="178">
+  <w:style w:type="paragraph" w:styleId="865">
     <w:name w:val="Footer"/>
-    <w:basedOn w:val="664"/>
-    <w:link w:val="179"/>
+    <w:basedOn w:val="888"/>
+    <w:link w:val="866"/>
     <w:uiPriority w:val="99"/>
     <w:unhideWhenUsed/>
     <w:pPr>
@@ -31638,10 +31799,10 @@
       <w:ind/>
     </w:pPr>
   </w:style>
-  <w:style w:type="character" w:styleId="179">
+  <w:style w:type="character" w:styleId="866">
     <w:name w:val="Footer Char"/>
-    <w:basedOn w:val="148"/>
-    <w:link w:val="178"/>
+    <w:basedOn w:val="838"/>
+    <w:link w:val="865"/>
     <w:uiPriority w:val="99"/>
     <w:pPr>
       <w:pBdr/>
@@ -31649,10 +31810,10 @@
       <w:ind/>
     </w:pPr>
   </w:style>
-  <w:style w:type="paragraph" w:styleId="180">
+  <w:style w:type="paragraph" w:styleId="867">
     <w:name w:val="Caption"/>
-    <w:basedOn w:val="664"/>
-    <w:next w:val="664"/>
+    <w:basedOn w:val="888"/>
+    <w:next w:val="888"/>
     <w:uiPriority w:val="35"/>
     <w:unhideWhenUsed/>
     <w:qFormat/>
@@ -31669,10 +31830,10 @@
       <w:szCs w:val="18"/>
     </w:rPr>
   </w:style>
-  <w:style w:type="paragraph" w:styleId="181">
+  <w:style w:type="paragraph" w:styleId="868">
     <w:name w:val="footnote text"/>
-    <w:basedOn w:val="664"/>
-    <w:link w:val="182"/>
+    <w:basedOn w:val="888"/>
+    <w:link w:val="869"/>
     <w:uiPriority w:val="99"/>
     <w:semiHidden/>
     <w:unhideWhenUsed/>
@@ -31686,10 +31847,10 @@
       <w:szCs w:val="20"/>
     </w:rPr>
   </w:style>
-  <w:style w:type="character" w:styleId="182">
+  <w:style w:type="character" w:styleId="869">
     <w:name w:val="Footnote Text Char"/>
-    <w:basedOn w:val="148"/>
-    <w:link w:val="181"/>
+    <w:basedOn w:val="838"/>
+    <w:link w:val="868"/>
     <w:uiPriority w:val="99"/>
     <w:semiHidden/>
     <w:pPr>
@@ -31702,9 +31863,9 @@
       <w:szCs w:val="20"/>
     </w:rPr>
   </w:style>
-  <w:style w:type="character" w:styleId="183">
+  <w:style w:type="character" w:styleId="870">
     <w:name w:val="footnote reference"/>
-    <w:basedOn w:val="148"/>
+    <w:basedOn w:val="838"/>
     <w:uiPriority w:val="99"/>
     <w:semiHidden/>
     <w:unhideWhenUsed/>
@@ -31717,10 +31878,10 @@
       <w:vertAlign w:val="superscript"/>
     </w:rPr>
   </w:style>
-  <w:style w:type="paragraph" w:styleId="184">
+  <w:style w:type="paragraph" w:styleId="871">
     <w:name w:val="endnote text"/>
-    <w:basedOn w:val="664"/>
-    <w:link w:val="185"/>
+    <w:basedOn w:val="888"/>
+    <w:link w:val="872"/>
     <w:uiPriority w:val="99"/>
     <w:semiHidden/>
     <w:unhideWhenUsed/>
@@ -31734,10 +31895,10 @@
       <w:szCs w:val="20"/>
     </w:rPr>
   </w:style>
-  <w:style w:type="character" w:styleId="185">
+  <w:style w:type="character" w:styleId="872">
     <w:name w:val="Endnote Text Char"/>
-    <w:basedOn w:val="148"/>
-    <w:link w:val="184"/>
+    <w:basedOn w:val="838"/>
+    <w:link w:val="871"/>
     <w:uiPriority w:val="99"/>
     <w:semiHidden/>
     <w:pPr>
@@ -31750,9 +31911,9 @@
       <w:szCs w:val="20"/>
     </w:rPr>
   </w:style>
-  <w:style w:type="character" w:styleId="186">
+  <w:style w:type="character" w:styleId="873">
     <w:name w:val="endnote reference"/>
-    <w:basedOn w:val="148"/>
+    <w:basedOn w:val="838"/>
     <w:uiPriority w:val="99"/>
     <w:semiHidden/>
     <w:unhideWhenUsed/>
@@ -31765,9 +31926,9 @@
       <w:vertAlign w:val="superscript"/>
     </w:rPr>
   </w:style>
-  <w:style w:type="character" w:styleId="187">
+  <w:style w:type="character" w:styleId="874">
     <w:name w:val="Hyperlink"/>
-    <w:basedOn w:val="148"/>
+    <w:basedOn w:val="838"/>
     <w:uiPriority w:val="99"/>
     <w:unhideWhenUsed/>
     <w:pPr>
@@ -31780,9 +31941,9 @@
       <w:u w:val="single"/>
     </w:rPr>
   </w:style>
-  <w:style w:type="character" w:styleId="188">
+  <w:style w:type="character" w:styleId="875">
     <w:name w:val="FollowedHyperlink"/>
-    <w:basedOn w:val="148"/>
+    <w:basedOn w:val="838"/>
     <w:uiPriority w:val="99"/>
     <w:semiHidden/>
     <w:unhideWhenUsed/>
@@ -31796,10 +31957,10 @@
       <w:u w:val="single"/>
     </w:rPr>
   </w:style>
-  <w:style w:type="paragraph" w:styleId="189">
+  <w:style w:type="paragraph" w:styleId="876">
     <w:name w:val="toc 1"/>
-    <w:basedOn w:val="664"/>
-    <w:next w:val="664"/>
+    <w:basedOn w:val="888"/>
+    <w:next w:val="888"/>
     <w:uiPriority w:val="39"/>
     <w:unhideWhenUsed/>
     <w:pPr>
@@ -31808,10 +31969,10 @@
       <w:ind/>
     </w:pPr>
   </w:style>
-  <w:style w:type="paragraph" w:styleId="190">
+  <w:style w:type="paragraph" w:styleId="877">
     <w:name w:val="toc 2"/>
-    <w:basedOn w:val="664"/>
-    <w:next w:val="664"/>
+    <w:basedOn w:val="888"/>
+    <w:next w:val="888"/>
     <w:uiPriority w:val="39"/>
     <w:unhideWhenUsed/>
     <w:pPr>
@@ -31820,10 +31981,10 @@
       <w:ind w:left="220"/>
     </w:pPr>
   </w:style>
-  <w:style w:type="paragraph" w:styleId="191">
+  <w:style w:type="paragraph" w:styleId="878">
     <w:name w:val="toc 3"/>
-    <w:basedOn w:val="664"/>
-    <w:next w:val="664"/>
+    <w:basedOn w:val="888"/>
+    <w:next w:val="888"/>
     <w:uiPriority w:val="39"/>
     <w:unhideWhenUsed/>
     <w:pPr>
@@ -31832,10 +31993,10 @@
       <w:ind w:left="440"/>
     </w:pPr>
   </w:style>
-  <w:style w:type="paragraph" w:styleId="192">
+  <w:style w:type="paragraph" w:styleId="879">
     <w:name w:val="toc 4"/>
-    <w:basedOn w:val="664"/>
-    <w:next w:val="664"/>
+    <w:basedOn w:val="888"/>
+    <w:next w:val="888"/>
     <w:uiPriority w:val="39"/>
     <w:unhideWhenUsed/>
     <w:pPr>
@@ -31844,10 +32005,10 @@
       <w:ind w:left="660"/>
     </w:pPr>
   </w:style>
-  <w:style w:type="paragraph" w:styleId="193">
+  <w:style w:type="paragraph" w:styleId="880">
     <w:name w:val="toc 5"/>
-    <w:basedOn w:val="664"/>
-    <w:next w:val="664"/>
+    <w:basedOn w:val="888"/>
+    <w:next w:val="888"/>
     <w:uiPriority w:val="39"/>
     <w:unhideWhenUsed/>
     <w:pPr>
@@ -31856,10 +32017,10 @@
       <w:ind w:left="880"/>
     </w:pPr>
   </w:style>
-  <w:style w:type="paragraph" w:styleId="194">
+  <w:style w:type="paragraph" w:styleId="881">
     <w:name w:val="toc 6"/>
-    <w:basedOn w:val="664"/>
-    <w:next w:val="664"/>
+    <w:basedOn w:val="888"/>
+    <w:next w:val="888"/>
     <w:uiPriority w:val="39"/>
     <w:unhideWhenUsed/>
     <w:pPr>
@@ -31868,10 +32029,10 @@
       <w:ind w:left="1100"/>
     </w:pPr>
   </w:style>
-  <w:style w:type="paragraph" w:styleId="195">
+  <w:style w:type="paragraph" w:styleId="882">
     <w:name w:val="toc 7"/>
-    <w:basedOn w:val="664"/>
-    <w:next w:val="664"/>
+    <w:basedOn w:val="888"/>
+    <w:next w:val="888"/>
     <w:uiPriority w:val="39"/>
     <w:unhideWhenUsed/>
     <w:pPr>
@@ -31880,10 +32041,10 @@
       <w:ind w:left="1320"/>
     </w:pPr>
   </w:style>
-  <w:style w:type="paragraph" w:styleId="196">
+  <w:style w:type="paragraph" w:styleId="883">
     <w:name w:val="toc 8"/>
-    <w:basedOn w:val="664"/>
-    <w:next w:val="664"/>
+    <w:basedOn w:val="888"/>
+    <w:next w:val="888"/>
     <w:uiPriority w:val="39"/>
     <w:unhideWhenUsed/>
     <w:pPr>
@@ -31892,10 +32053,10 @@
       <w:ind w:left="1540"/>
     </w:pPr>
   </w:style>
-  <w:style w:type="paragraph" w:styleId="197">
+  <w:style w:type="paragraph" w:styleId="884">
     <w:name w:val="toc 9"/>
-    <w:basedOn w:val="664"/>
-    <w:next w:val="664"/>
+    <w:basedOn w:val="888"/>
+    <w:next w:val="888"/>
     <w:uiPriority w:val="39"/>
     <w:unhideWhenUsed/>
     <w:pPr>
@@ -31904,9 +32065,9 @@
       <w:ind w:left="1760"/>
     </w:pPr>
   </w:style>
-  <w:style w:type="character" w:styleId="198">
+  <w:style w:type="character" w:styleId="885">
     <w:name w:val="Placeholder Text"/>
-    <w:basedOn w:val="148"/>
+    <w:basedOn w:val="838"/>
     <w:uiPriority w:val="99"/>
     <w:semiHidden/>
     <w:pPr>
@@ -31918,7 +32079,7 @@
       <w:color w:val="666666"/>
     </w:rPr>
   </w:style>
-  <w:style w:type="paragraph" w:styleId="208">
+  <w:style w:type="paragraph" w:styleId="886">
     <w:name w:val="TOC Heading"/>
     <w:uiPriority w:val="39"/>
     <w:unhideWhenUsed/>
@@ -31928,10 +32089,10 @@
       <w:ind/>
     </w:pPr>
   </w:style>
-  <w:style w:type="paragraph" w:styleId="209">
+  <w:style w:type="paragraph" w:styleId="887">
     <w:name w:val="table of figures"/>
-    <w:basedOn w:val="664"/>
-    <w:next w:val="664"/>
+    <w:basedOn w:val="888"/>
+    <w:next w:val="888"/>
     <w:uiPriority w:val="99"/>
     <w:unhideWhenUsed/>
     <w:pPr>
@@ -31940,7 +32101,7 @@
       <w:ind/>
     </w:pPr>
   </w:style>
-  <w:style w:type="paragraph" w:styleId="664" w:default="1">
+  <w:style w:type="paragraph" w:styleId="888" w:default="1">
     <w:name w:val="Normal"/>
     <w:qFormat/>
     <w:pPr>
@@ -31949,7 +32110,7 @@
       <w:ind/>
     </w:pPr>
   </w:style>
-  <w:style w:type="table" w:styleId="665" w:default="1">
+  <w:style w:type="table" w:styleId="889" w:default="1">
     <w:name w:val="Normal Table"/>
     <w:uiPriority w:val="99"/>
     <w:semiHidden/>
@@ -32142,7 +32303,7 @@
       </w:tcPr>
     </w:tblStylePr>
   </w:style>
-  <w:style w:type="numbering" w:styleId="666" w:default="1">
+  <w:style w:type="numbering" w:styleId="890" w:default="1">
     <w:name w:val="No List"/>
     <w:uiPriority w:val="99"/>
     <w:semiHidden/>
@@ -32153,9 +32314,9 @@
       <w:ind/>
     </w:pPr>
   </w:style>
-  <w:style w:type="paragraph" w:styleId="667">
+  <w:style w:type="paragraph" w:styleId="891">
     <w:name w:val="No Spacing"/>
-    <w:basedOn w:val="664"/>
+    <w:basedOn w:val="888"/>
     <w:uiPriority w:val="1"/>
     <w:qFormat/>
     <w:pPr>
@@ -32164,9 +32325,9 @@
       <w:ind/>
     </w:pPr>
   </w:style>
-  <w:style w:type="paragraph" w:styleId="668">
+  <w:style w:type="paragraph" w:styleId="892">
     <w:name w:val="List Paragraph"/>
-    <w:basedOn w:val="664"/>
+    <w:basedOn w:val="888"/>
     <w:uiPriority w:val="34"/>
     <w:qFormat/>
     <w:pPr>

</xml_diff>